<commit_message>
Expand dental caries quizzes to 120 questions per lesson
</commit_message>
<xml_diff>
--- a/TN Sâu Răng Học AI/Bài 1. Quan niệm mới trong chẩn đoán và điều trị bệnh sâu răng.docx
+++ b/TN Sâu Răng Học AI/Bài 1. Quan niệm mới trong chẩn đoán và điều trị bệnh sâu răng.docx
@@ -12,7 +12,7 @@
     </w:p>
     <w:p>
       <w:r>
-        <w:t>Bộ câu hỏi ôn tập · 80 câu · Từ nhận biết đến vận dụng lâm sàng</w:t>
+        <w:t>Bộ câu hỏi ôn tập · 120 câu · Từ nhận biết đến vận dụng lâm sàng</w:t>
       </w:r>
     </w:p>
     <w:p>
@@ -4602,6 +4602,2294 @@
       </w:pPr>
       <w:r>
         <w:t>Giải thích: Phục hồi phải nằm trong đánh giá bệnh nhân và sang thương, kể cả nguy cơ và biến chứng.</w:t>
+      </w:r>
+    </w:p>
+    <w:p>
+      <w:pPr>
+        <w:pStyle w:val="Heading1"/>
+      </w:pPr>
+      <w:r>
+        <w:t>Tình huống mở rộng</w:t>
+      </w:r>
+    </w:p>
+    <w:p>
+      <w:pPr>
+        <w:pStyle w:val="Question"/>
+      </w:pPr>
+      <w:r>
+        <w:t>Câu 81. Hai người có mảng bám ở hố rãnh tương tự nhau. Người A thường ăn đường giữa các bữa và có đốm men mới; người B ít tiếp xúc đường, không có tổn thương. Kết luận nào giải thích tốt nhất sự khác biệt?</w:t>
+      </w:r>
+    </w:p>
+    <w:p>
+      <w:pPr>
+        <w:pStyle w:val="Option"/>
+      </w:pPr>
+      <w:r>
+        <w:t>A. Sự khác biệt chứng minh S. mutans không tham gia sâu răng</w:t>
+      </w:r>
+    </w:p>
+    <w:p>
+      <w:pPr>
+        <w:pStyle w:val="Option"/>
+      </w:pPr>
+      <w:r>
+        <w:t>B. Chỉ cần thấy mảng bám là phải chẩn đoán cả hai đã có lỗ sâu</w:t>
+      </w:r>
+    </w:p>
+    <w:p>
+      <w:pPr>
+        <w:pStyle w:val="Option"/>
+      </w:pPr>
+      <w:r>
+        <w:t>C. Người B chắc chắn không có vi khuẩn trên răng</w:t>
+      </w:r>
+    </w:p>
+    <w:p>
+      <w:pPr>
+        <w:pStyle w:val="Option"/>
+      </w:pPr>
+      <w:r>
+        <w:t>D. Mảng bám là điều kiện cần nhưng cơ chất và thời gian tiếp xúc acid cùng yếu tố bảo vệ quyết định diễn tiến</w:t>
+      </w:r>
+    </w:p>
+    <w:p>
+      <w:pPr>
+        <w:pStyle w:val="Answer"/>
+        <w:keepNext/>
+      </w:pPr>
+      <w:r>
+        <w:t>Đáp án: D</w:t>
+      </w:r>
+    </w:p>
+    <w:p>
+      <w:pPr>
+        <w:pStyle w:val="Answer"/>
+      </w:pPr>
+      <w:r>
+        <w:t>Giải thích: SGK nhấn mạnh vi khuẩn tại chỗ cần nhưng chưa đủ; chế độ ăn và thời gian góp phần quyết định cân bằng mất/tái khoáng.</w:t>
+      </w:r>
+    </w:p>
+    <w:p>
+      <w:pPr>
+        <w:pStyle w:val="Question"/>
+      </w:pPr>
+      <w:r>
+        <w:t>Câu 82. Sau một thời gian thường ngậm kẹo dính, người bệnh có mảng bám bám chắc ở rãnh răng và nhiều đợt pH mảng bám giảm. Theo cơ chế SGK, sucrose đã góp phần bằng cặp tác động nào?</w:t>
+      </w:r>
+    </w:p>
+    <w:p>
+      <w:pPr>
+        <w:pStyle w:val="Option"/>
+      </w:pPr>
+      <w:r>
+        <w:t>A. Chỉ làm đổi màu răng mà không ảnh hưởng pH</w:t>
+      </w:r>
+    </w:p>
+    <w:p>
+      <w:pPr>
+        <w:pStyle w:val="Option"/>
+      </w:pPr>
+      <w:r>
+        <w:t>B. Làm cơ chất tạo dextran dính và sản phẩm acid</w:t>
+      </w:r>
+    </w:p>
+    <w:p>
+      <w:pPr>
+        <w:pStyle w:val="Option"/>
+      </w:pPr>
+      <w:r>
+        <w:t>C. Làm mất ngay cảm giác tủy và tạo ngà thứ ba</w:t>
+      </w:r>
+    </w:p>
+    <w:p>
+      <w:pPr>
+        <w:pStyle w:val="Option"/>
+      </w:pPr>
+      <w:r>
+        <w:t>D. Trực tiếp làm men răng cứng hơn và tăng tiết nước bọt</w:t>
+      </w:r>
+    </w:p>
+    <w:p>
+      <w:pPr>
+        <w:pStyle w:val="Answer"/>
+        <w:keepNext/>
+      </w:pPr>
+      <w:r>
+        <w:t>Đáp án: B</w:t>
+      </w:r>
+    </w:p>
+    <w:p>
+      <w:pPr>
+        <w:pStyle w:val="Answer"/>
+      </w:pPr>
+      <w:r>
+        <w:t>Giải thích: Vi khuẩn chuyển hóa sucrose vừa tạo dextran hỗ trợ bám dính, vừa tạo acid gây mất khoáng.</w:t>
+      </w:r>
+    </w:p>
+    <w:p>
+      <w:pPr>
+        <w:pStyle w:val="Question"/>
+      </w:pPr>
+      <w:r>
+        <w:t>Câu 83. Một người dùng kem fluor đều nhưng vẫn có hai tổn thương mới, khô miệng do thuốc và nhiều lần ăn vặt. Khi đánh giá nguy cơ, cách kết luận nào phù hợp nhất?</w:t>
+      </w:r>
+    </w:p>
+    <w:p>
+      <w:pPr>
+        <w:pStyle w:val="Option"/>
+      </w:pPr>
+      <w:r>
+        <w:t>A. Kem fluor dùng đều tự động xếp nguy cơ thấp bất kể tổn thương mới</w:t>
+      </w:r>
+    </w:p>
+    <w:p>
+      <w:pPr>
+        <w:pStyle w:val="Option"/>
+      </w:pPr>
+      <w:r>
+        <w:t>B. Không thể sâu răng nếu trong kem có fluor</w:t>
+      </w:r>
+    </w:p>
+    <w:p>
+      <w:pPr>
+        <w:pStyle w:val="Option"/>
+      </w:pPr>
+      <w:r>
+        <w:t>C. Chỉ cần đo màu men để biết nguy cơ toàn miệng</w:t>
+      </w:r>
+    </w:p>
+    <w:p>
+      <w:pPr>
+        <w:pStyle w:val="Option"/>
+      </w:pPr>
+      <w:r>
+        <w:t>D. Vẫn cần xem là có nhiều yếu tố nguy cơ và đánh giá tổng hợp, dù đã có một yếu tố bảo vệ</w:t>
+      </w:r>
+    </w:p>
+    <w:p>
+      <w:pPr>
+        <w:pStyle w:val="Answer"/>
+        <w:keepNext/>
+      </w:pPr>
+      <w:r>
+        <w:t>Đáp án: D</w:t>
+      </w:r>
+    </w:p>
+    <w:p>
+      <w:pPr>
+        <w:pStyle w:val="Answer"/>
+      </w:pPr>
+      <w:r>
+        <w:t>Giải thích: Nguy cơ được xác định từ nhiều yếu tố; tổn thương mới và khô miệng không bị xóa bởi một yếu tố bảo vệ.</w:t>
+      </w:r>
+    </w:p>
+    <w:p>
+      <w:pPr>
+        <w:pStyle w:val="Question"/>
+      </w:pPr>
+      <w:r>
+        <w:t>Câu 84. Một người chải răng tốt nhưng liên tiếp xuất hiện tổn thương ở mặt kẽ. Nhóm dữ kiện nào cần bổ sung trước khi quy mọi nguyên nhân cho vệ sinh kém?</w:t>
+      </w:r>
+    </w:p>
+    <w:p>
+      <w:pPr>
+        <w:pStyle w:val="Option"/>
+      </w:pPr>
+      <w:r>
+        <w:t>A. Chỉ giới tính và cân nặng</w:t>
+      </w:r>
+    </w:p>
+    <w:p>
+      <w:pPr>
+        <w:pStyle w:val="Option"/>
+      </w:pPr>
+      <w:r>
+        <w:t>B. Chỉ số lượng bàn chải đã mua</w:t>
+      </w:r>
+    </w:p>
+    <w:p>
+      <w:pPr>
+        <w:pStyle w:val="Option"/>
+      </w:pPr>
+      <w:r>
+        <w:t>C. Chỉ màu vật liệu trám ở răng đối diện</w:t>
+      </w:r>
+    </w:p>
+    <w:p>
+      <w:pPr>
+        <w:pStyle w:val="Option"/>
+      </w:pPr>
+      <w:r>
+        <w:t>D. Tần suất đường, làm sạch kẽ, nước bọt và tiếp xúc fluor</w:t>
+      </w:r>
+    </w:p>
+    <w:p>
+      <w:pPr>
+        <w:pStyle w:val="Answer"/>
+        <w:keepNext/>
+      </w:pPr>
+      <w:r>
+        <w:t>Đáp án: D</w:t>
+      </w:r>
+    </w:p>
+    <w:p>
+      <w:pPr>
+        <w:pStyle w:val="Answer"/>
+      </w:pPr>
+      <w:r>
+        <w:t>Giải thích: SGK yêu cầu đánh giá chế độ ăn, ký chủ/nước bọt, fluor và yếu tố vi khuẩn; mặt kẽ cũng cần được làm sạch riêng.</w:t>
+      </w:r>
+    </w:p>
+    <w:p>
+      <w:pPr>
+        <w:pStyle w:val="Question"/>
+      </w:pPr>
+      <w:r>
+        <w:t>Câu 85. Ở một bệnh nhân trẻ, phim và hồ sơ cách nhau 6 tháng cho thấy tổn thương tiến đến một phần ba ngoài ngà. Trong bảng nguy cơ của SGK, dữ kiện này gợi gì?</w:t>
+      </w:r>
+    </w:p>
+    <w:p>
+      <w:pPr>
+        <w:pStyle w:val="Option"/>
+      </w:pPr>
+      <w:r>
+        <w:t>A. Một dấu hiệu nguy cơ sâu răng cao do tiến triển nhanh</w:t>
+      </w:r>
+    </w:p>
+    <w:p>
+      <w:pPr>
+        <w:pStyle w:val="Option"/>
+      </w:pPr>
+      <w:r>
+        <w:t>B. Bằng chứng tủy đã hoại tử</w:t>
+      </w:r>
+    </w:p>
+    <w:p>
+      <w:pPr>
+        <w:pStyle w:val="Option"/>
+      </w:pPr>
+      <w:r>
+        <w:t>C. Bằng chứng không cần xem xét thêm chế độ ăn hoặc nước bọt</w:t>
+      </w:r>
+    </w:p>
+    <w:p>
+      <w:pPr>
+        <w:pStyle w:val="Option"/>
+      </w:pPr>
+      <w:r>
+        <w:t>D. Một sang thương chắc chắn bất hoạt vì chỉ ở một phần ba ngoài ngà</w:t>
+      </w:r>
+    </w:p>
+    <w:p>
+      <w:pPr>
+        <w:pStyle w:val="Answer"/>
+        <w:keepNext/>
+      </w:pPr>
+      <w:r>
+        <w:t>Đáp án: A</w:t>
+      </w:r>
+    </w:p>
+    <w:p>
+      <w:pPr>
+        <w:pStyle w:val="Answer"/>
+      </w:pPr>
+      <w:r>
+        <w:t>Giải thích: SGK liệt kê tổn thương tiến triển đến một phần ba ngoài ngà trong 6 tháng ở người trẻ là yếu tố nguy cơ cao, nhưng vẫn cần đánh giá toàn bộ.</w:t>
+      </w:r>
+    </w:p>
+    <w:p>
+      <w:pPr>
+        <w:pStyle w:val="Question"/>
+      </w:pPr>
+      <w:r>
+        <w:t>Câu 86. Một thiếu niên chưa thấy lỗ sâu nhưng hố rãnh rất sâu chưa trám bít, không dùng fluor và ít tái khám. Cách xử lý thông tin nào đúng theo SGK?</w:t>
+      </w:r>
+    </w:p>
+    <w:p>
+      <w:pPr>
+        <w:pStyle w:val="Option"/>
+      </w:pPr>
+      <w:r>
+        <w:t>A. Ghi nhận nhiều yếu tố nguy cơ, khám bề mặt kỹ và lên kế hoạch phòng ngừa phù hợp</w:t>
+      </w:r>
+    </w:p>
+    <w:p>
+      <w:pPr>
+        <w:pStyle w:val="Option"/>
+      </w:pPr>
+      <w:r>
+        <w:t>B. Chỉ xét nghiệm vi khuẩn mới được khám mặt nhai</w:t>
+      </w:r>
+    </w:p>
+    <w:p>
+      <w:pPr>
+        <w:pStyle w:val="Option"/>
+      </w:pPr>
+      <w:r>
+        <w:t>C. Không có lỗ nên chắc chắn nguy cơ thấp</w:t>
+      </w:r>
+    </w:p>
+    <w:p>
+      <w:pPr>
+        <w:pStyle w:val="Option"/>
+      </w:pPr>
+      <w:r>
+        <w:t>D. Chẩn đoán ngay viêm tủy dù không triệu chứng</w:t>
+      </w:r>
+    </w:p>
+    <w:p>
+      <w:pPr>
+        <w:pStyle w:val="Answer"/>
+        <w:keepNext/>
+      </w:pPr>
+      <w:r>
+        <w:t>Đáp án: A</w:t>
+      </w:r>
+    </w:p>
+    <w:p>
+      <w:pPr>
+        <w:pStyle w:val="Answer"/>
+      </w:pPr>
+      <w:r>
+        <w:t>Giải thích: Các yếu tố được SGK liệt kê thuộc nguy cơ cao; chưa có lỗ không đồng nghĩa không cần dự phòng.</w:t>
+      </w:r>
+    </w:p>
+    <w:p>
+      <w:pPr>
+        <w:pStyle w:val="Question"/>
+      </w:pPr>
+      <w:r>
+        <w:t>Câu 87. Hai bệnh nhân có kết quả S. mutans tương tự. Một người có nước bọt tốt, hạn chế đường; người còn lại khô miệng và ăn ngọt nhiều lần. Theo quan niệm đa yếu tố của SGK, kết luận nào hợp lý?</w:t>
+      </w:r>
+    </w:p>
+    <w:p>
+      <w:pPr>
+        <w:pStyle w:val="Option"/>
+      </w:pPr>
+      <w:r>
+        <w:t>A. Kết quả vi khuẩn thay thế hoàn toàn khám lâm sàng</w:t>
+      </w:r>
+    </w:p>
+    <w:p>
+      <w:pPr>
+        <w:pStyle w:val="Option"/>
+      </w:pPr>
+      <w:r>
+        <w:t>B. Không thể xếp nguy cơ chỉ từ mật độ vi khuẩn; cần xét nước bọt và chế độ ăn</w:t>
+      </w:r>
+    </w:p>
+    <w:p>
+      <w:pPr>
+        <w:pStyle w:val="Option"/>
+      </w:pPr>
+      <w:r>
+        <w:t>C. Hai người bắt buộc có cùng số lỗ sâu</w:t>
+      </w:r>
+    </w:p>
+    <w:p>
+      <w:pPr>
+        <w:pStyle w:val="Option"/>
+      </w:pPr>
+      <w:r>
+        <w:t>D. Chỉ người có nước bọt tốt cần can thiệp</w:t>
+      </w:r>
+    </w:p>
+    <w:p>
+      <w:pPr>
+        <w:pStyle w:val="Answer"/>
+        <w:keepNext/>
+      </w:pPr>
+      <w:r>
+        <w:t>Đáp án: B</w:t>
+      </w:r>
+    </w:p>
+    <w:p>
+      <w:pPr>
+        <w:pStyle w:val="Answer"/>
+      </w:pPr>
+      <w:r>
+        <w:t>Giải thích: Giáo trình yêu cầu kết hợp yếu tố ký chủ, vi khuẩn, ăn uống và dấu lâm sàng thay vì dùng một thông số đơn lẻ.</w:t>
+      </w:r>
+    </w:p>
+    <w:p>
+      <w:pPr>
+        <w:pStyle w:val="Question"/>
+      </w:pPr>
+      <w:r>
+        <w:t>Câu 88. Trong mô hình giải thích của SGK, pH mảng bám lần lượt giảm đến khoảng 5,0 rồi 4,3. Diễn giải nào đúng nhất về hai pha acid này?</w:t>
+      </w:r>
+    </w:p>
+    <w:p>
+      <w:pPr>
+        <w:pStyle w:val="Option"/>
+      </w:pPr>
+      <w:r>
+        <w:t>A. Ở khoảng 5,0 hydroxyapatite men có thể mất khoáng; ở 4,3 cả fluorapatite cũng có thể bị hòa tan</w:t>
+      </w:r>
+    </w:p>
+    <w:p>
+      <w:pPr>
+        <w:pStyle w:val="Option"/>
+      </w:pPr>
+      <w:r>
+        <w:t>B. Ở cả hai mức pH, men chắc chắn được tái khoáng</w:t>
+      </w:r>
+    </w:p>
+    <w:p>
+      <w:pPr>
+        <w:pStyle w:val="Option"/>
+      </w:pPr>
+      <w:r>
+        <w:t>C. Chỉ fluorapatite hòa tan ở 5,0 còn hydroxyapatite không</w:t>
+      </w:r>
+    </w:p>
+    <w:p>
+      <w:pPr>
+        <w:pStyle w:val="Option"/>
+      </w:pPr>
+      <w:r>
+        <w:t>D. Một lần đo pH đủ để chẩn đoán có lỗ sâu và tình trạng tủy</w:t>
+      </w:r>
+    </w:p>
+    <w:p>
+      <w:pPr>
+        <w:pStyle w:val="Answer"/>
+        <w:keepNext/>
+      </w:pPr>
+      <w:r>
+        <w:t>Đáp án: A</w:t>
+      </w:r>
+    </w:p>
+    <w:p>
+      <w:pPr>
+        <w:pStyle w:val="Answer"/>
+      </w:pPr>
+      <w:r>
+        <w:t>Giải thích: SGK nêu ngưỡng minh họa pH &lt;5,5 cho hydroxyapatite và &lt;4,5 cho fluorapatite; đó không là xét nghiệm chẩn đoán đơn độc.</w:t>
+      </w:r>
+    </w:p>
+    <w:p>
+      <w:pPr>
+        <w:pStyle w:val="Question"/>
+      </w:pPr>
+      <w:r>
+        <w:t>Câu 89. Hai răng cối có cùng hình thái rãnh và cùng mức mảng bám; một răng vừa mọc, răng kia đã mọc nhiều năm. Theo bài học, yếu tố nào khiến răng vừa mọc cần được chú ý hơn?</w:t>
+      </w:r>
+    </w:p>
+    <w:p>
+      <w:pPr>
+        <w:pStyle w:val="Option"/>
+      </w:pPr>
+      <w:r>
+        <w:t>A. Răng mọc lâu năm không bao giờ mất khoáng</w:t>
+      </w:r>
+    </w:p>
+    <w:p>
+      <w:pPr>
+        <w:pStyle w:val="Option"/>
+      </w:pPr>
+      <w:r>
+        <w:t>B. Răng vừa mọc đã mặc nhiên có sealant bảo vệ</w:t>
+      </w:r>
+    </w:p>
+    <w:p>
+      <w:pPr>
+        <w:pStyle w:val="Option"/>
+      </w:pPr>
+      <w:r>
+        <w:t>C. Men mới mọc giàu carbonate và chưa hoàn tất trưởng thành sau mọc</w:t>
+      </w:r>
+    </w:p>
+    <w:p>
+      <w:pPr>
+        <w:pStyle w:val="Option"/>
+      </w:pPr>
+      <w:r>
+        <w:t>D. Men mới mọc hoàn toàn không chứa tinh thể apatite</w:t>
+      </w:r>
+    </w:p>
+    <w:p>
+      <w:pPr>
+        <w:pStyle w:val="Answer"/>
+        <w:keepNext/>
+      </w:pPr>
+      <w:r>
+        <w:t>Đáp án: C</w:t>
+      </w:r>
+    </w:p>
+    <w:p>
+      <w:pPr>
+        <w:pStyle w:val="Answer"/>
+      </w:pPr>
+      <w:r>
+        <w:t>Giải thích: Men mới mọc có apatite chứa nhiều carbonate, dễ hòa tan acid hơn; qua thời gian và chu kỳ khoáng hóa, men đề kháng hơn.</w:t>
+      </w:r>
+    </w:p>
+    <w:p>
+      <w:pPr>
+        <w:pStyle w:val="Question"/>
+      </w:pPr>
+      <w:r>
+        <w:t>Câu 90. Hai đốm trắng cùng kích thước: đốm A trơn bóng, không giữ mảng bám và ổn định qua theo dõi; đốm B thô ráp ở vùng mảng bám, mới xuất hiện. Điều gì cần được ưu tiên khi so sánh hoạt tính?</w:t>
+      </w:r>
+    </w:p>
+    <w:p>
+      <w:pPr>
+        <w:pStyle w:val="Option"/>
+      </w:pPr>
+      <w:r>
+        <w:t>A. B có dữ kiện gợi hoạt động hơn; A có thể bất hoạt dù vẫn trắng</w:t>
+      </w:r>
+    </w:p>
+    <w:p>
+      <w:pPr>
+        <w:pStyle w:val="Option"/>
+      </w:pPr>
+      <w:r>
+        <w:t>B. Cả hai chắc chắn hoạt động chỉ vì cùng màu trắng</w:t>
+      </w:r>
+    </w:p>
+    <w:p>
+      <w:pPr>
+        <w:pStyle w:val="Option"/>
+      </w:pPr>
+      <w:r>
+        <w:t>C. Không thể đánh giá hoạt tính nếu chưa có lỗ sâu</w:t>
+      </w:r>
+    </w:p>
+    <w:p>
+      <w:pPr>
+        <w:pStyle w:val="Option"/>
+      </w:pPr>
+      <w:r>
+        <w:t>D. A hoạt động hơn vì bề mặt bóng</w:t>
+      </w:r>
+    </w:p>
+    <w:p>
+      <w:pPr>
+        <w:pStyle w:val="Answer"/>
+        <w:keepNext/>
+      </w:pPr>
+      <w:r>
+        <w:t>Đáp án: A</w:t>
+      </w:r>
+    </w:p>
+    <w:p>
+      <w:pPr>
+        <w:pStyle w:val="Answer"/>
+      </w:pPr>
+      <w:r>
+        <w:t>Giải thích: SGK có ví dụ tổn thương trắng nhưng trơn bóng, vệ sinh cải thiện là bất hoạt; hoạt tính cần xét bề mặt, mảng bám và diễn tiến.</w:t>
+      </w:r>
+    </w:p>
+    <w:p>
+      <w:pPr>
+        <w:pStyle w:val="Question"/>
+      </w:pPr>
+      <w:r>
+        <w:t>Câu 91. Một trẻ có các vệt trắng mờ đối xứng ở nhiều răng cùng thời kỳ mọc; một vị trí khác có đốm trắng khu trú cạnh vùng giữ mảng bám. Cách suy luận nào đúng nhất?</w:t>
+      </w:r>
+    </w:p>
+    <w:p>
+      <w:pPr>
+        <w:pStyle w:val="Option"/>
+      </w:pPr>
+      <w:r>
+        <w:t>A. Cả hai vùng chắc chắn là cùng một lỗ sâu ngà</w:t>
+      </w:r>
+    </w:p>
+    <w:p>
+      <w:pPr>
+        <w:pStyle w:val="Option"/>
+      </w:pPr>
+      <w:r>
+        <w:t>B. Đốm khu trú chứng minh tất cả vệt đối xứng đang sâu hoạt động</w:t>
+      </w:r>
+    </w:p>
+    <w:p>
+      <w:pPr>
+        <w:pStyle w:val="Option"/>
+      </w:pPr>
+      <w:r>
+        <w:t>C. Vệt đối xứng cần phân biệt nhiễm fluor; đốm khu trú cần đánh giá sâu men và hoạt tính riêng</w:t>
+      </w:r>
+    </w:p>
+    <w:p>
+      <w:pPr>
+        <w:pStyle w:val="Option"/>
+      </w:pPr>
+      <w:r>
+        <w:t>D. Không cần xét sự phân bố vì mọi đổi màu men giống nhau</w:t>
+      </w:r>
+    </w:p>
+    <w:p>
+      <w:pPr>
+        <w:pStyle w:val="Answer"/>
+        <w:keepNext/>
+      </w:pPr>
+      <w:r>
+        <w:t>Đáp án: C</w:t>
+      </w:r>
+    </w:p>
+    <w:p>
+      <w:pPr>
+        <w:pStyle w:val="Answer"/>
+      </w:pPr>
+      <w:r>
+        <w:t>Giải thích: Tài liệu nhóm mô tả nhiễm fluor thường có phân bố đối xứng; tổn thương sâu răng cần xét vị trí giữ mảng bám và dấu tiến triển.</w:t>
+      </w:r>
+    </w:p>
+    <w:p>
+      <w:pPr>
+        <w:pStyle w:val="Question"/>
+      </w:pPr>
+      <w:r>
+        <w:t>Câu 92. Nhiều răng hình thành cùng thời kỳ có khiếm khuyết men chạy ngang ở mặt ngoài, hiện diện từ khi mọc chứ không mới xuất hiện tại vùng mảng bám. Trong chẩn đoán phân biệt của tài liệu nhóm, lựa chọn nào phù hợp nhất?</w:t>
+      </w:r>
+    </w:p>
+    <w:p>
+      <w:pPr>
+        <w:pStyle w:val="Option"/>
+      </w:pPr>
+      <w:r>
+        <w:t>A. Ngà xơ cứng sau sâu răng</w:t>
+      </w:r>
+    </w:p>
+    <w:p>
+      <w:pPr>
+        <w:pStyle w:val="Option"/>
+      </w:pPr>
+      <w:r>
+        <w:t>B. Sâu ngà có lỗ hoạt động</w:t>
+      </w:r>
+    </w:p>
+    <w:p>
+      <w:pPr>
+        <w:pStyle w:val="Option"/>
+      </w:pPr>
+      <w:r>
+        <w:t>C. Áp xe quanh chóp</w:t>
+      </w:r>
+    </w:p>
+    <w:p>
+      <w:pPr>
+        <w:pStyle w:val="Option"/>
+      </w:pPr>
+      <w:r>
+        <w:t>D. Thiểu sản men</w:t>
+      </w:r>
+    </w:p>
+    <w:p>
+      <w:pPr>
+        <w:pStyle w:val="Answer"/>
+        <w:keepNext/>
+      </w:pPr>
+      <w:r>
+        <w:t>Đáp án: D</w:t>
+      </w:r>
+    </w:p>
+    <w:p>
+      <w:pPr>
+        <w:pStyle w:val="Answer"/>
+      </w:pPr>
+      <w:r>
+        <w:t>Giải thích: Tài liệu nhóm mô tả thiểu sản men có khuyết men theo chiều ngang tại các răng cùng thời gian khoáng hóa.</w:t>
+      </w:r>
+    </w:p>
+    <w:p>
+      <w:pPr>
+        <w:pStyle w:val="Question"/>
+      </w:pPr>
+      <w:r>
+        <w:t>Câu 93. Trẻ nhỏ có nhiều răng cửa sữa hàm trên mất chất lan nhanh từ rìa cắn về cổ răng, phá hủy rộng thân răng. Theo đúng cách gọi trong mục chẩn đoán phân biệt của tài liệu nhóm, tên nào được dùng cho hình thái này?</w:t>
+      </w:r>
+    </w:p>
+    <w:p>
+      <w:pPr>
+        <w:pStyle w:val="Option"/>
+      </w:pPr>
+      <w:r>
+        <w:t>A. Tiêu lõm hình chêm ở răng vĩnh viễn</w:t>
+      </w:r>
+    </w:p>
+    <w:p>
+      <w:pPr>
+        <w:pStyle w:val="Option"/>
+      </w:pPr>
+      <w:r>
+        <w:t>B. Sún răng ở trẻ em (thuật ngữ tài liệu nhóm)</w:t>
+      </w:r>
+    </w:p>
+    <w:p>
+      <w:pPr>
+        <w:pStyle w:val="Option"/>
+      </w:pPr>
+      <w:r>
+        <w:t>C. Nhiễm fluor đối xứng không mất chất</w:t>
+      </w:r>
+    </w:p>
+    <w:p>
+      <w:pPr>
+        <w:pStyle w:val="Option"/>
+      </w:pPr>
+      <w:r>
+        <w:t>D. Đốm trắng bất hoạt đơn độc</w:t>
+      </w:r>
+    </w:p>
+    <w:p>
+      <w:pPr>
+        <w:pStyle w:val="Answer"/>
+        <w:keepNext/>
+      </w:pPr>
+      <w:r>
+        <w:t>Đáp án: B</w:t>
+      </w:r>
+    </w:p>
+    <w:p>
+      <w:pPr>
+        <w:pStyle w:val="Answer"/>
+      </w:pPr>
+      <w:r>
+        <w:t>Giải thích: Mục 4.1.4 và Hình 4.6 của tài liệu nhóm dùng tên 'sún răng' cho mô tả này. Đây là nhận diện thuật ngữ trong nguồn học; hình thái đơn lẻ chưa đủ thay cho khám và chẩn đoán phân biệt ở trẻ cụ thể.</w:t>
+      </w:r>
+    </w:p>
+    <w:p>
+      <w:pPr>
+        <w:pStyle w:val="Question"/>
+      </w:pPr>
+      <w:r>
+        <w:t>Câu 94. Ở răng 34, khuyết cổ răng hình chữ V, bờ sắc và đáy cứng; ở răng 35, khuyết cổ răng giữ mảng bám, đáy mềm. Ghép nhận định nào sát tài liệu nhóm nhất?</w:t>
+      </w:r>
+    </w:p>
+    <w:p>
+      <w:pPr>
+        <w:pStyle w:val="Option"/>
+      </w:pPr>
+      <w:r>
+        <w:t>A. Cả hai chắc chắn là sâu ngà hoạt động</w:t>
+      </w:r>
+    </w:p>
+    <w:p>
+      <w:pPr>
+        <w:pStyle w:val="Option"/>
+      </w:pPr>
+      <w:r>
+        <w:t>B. Răng 34 gợi tiêu lõm hình chêm; răng 35 cần đánh giá sâu cổ răng</w:t>
+      </w:r>
+    </w:p>
+    <w:p>
+      <w:pPr>
+        <w:pStyle w:val="Option"/>
+      </w:pPr>
+      <w:r>
+        <w:t>C. Răng 34 chắc chắn sâu hơn vì đáy cứng</w:t>
+      </w:r>
+    </w:p>
+    <w:p>
+      <w:pPr>
+        <w:pStyle w:val="Option"/>
+      </w:pPr>
+      <w:r>
+        <w:t>D. Răng 35 chắc chắn chỉ là nhiễm fluor men</w:t>
+      </w:r>
+    </w:p>
+    <w:p>
+      <w:pPr>
+        <w:pStyle w:val="Answer"/>
+        <w:keepNext/>
+      </w:pPr>
+      <w:r>
+        <w:t>Đáp án: B</w:t>
+      </w:r>
+    </w:p>
+    <w:p>
+      <w:pPr>
+        <w:pStyle w:val="Answer"/>
+      </w:pPr>
+      <w:r>
+        <w:t>Giải thích: Hình chêm bờ sắc, đáy cứng gợi tổn thương không sâu; đáy mềm và mảng bám làm tăng nghi ngờ sâu răng.</w:t>
+      </w:r>
+    </w:p>
+    <w:p>
+      <w:pPr>
+        <w:pStyle w:val="Question"/>
+      </w:pPr>
+      <w:r>
+        <w:t>Câu 95. Một hố rãnh đổi màu vàng nâu rõ ngay khi còn ướt nhưng sau làm sạch không thấy lỗ, chưa lộ ngà. Nếu buộc dùng bảng S1/S2/S3 của tài liệu nhóm, xếp nhóm nào trước?</w:t>
+      </w:r>
+    </w:p>
+    <w:p>
+      <w:pPr>
+        <w:pStyle w:val="Option"/>
+      </w:pPr>
+      <w:r>
+        <w:t>A. S3 vì mọi màu nâu đều là lỗ sâu lớn</w:t>
+      </w:r>
+    </w:p>
+    <w:p>
+      <w:pPr>
+        <w:pStyle w:val="Option"/>
+      </w:pPr>
+      <w:r>
+        <w:t>B. S1, đồng thời tiếp tục đánh giá hoạt tính và nguy cơ</w:t>
+      </w:r>
+    </w:p>
+    <w:p>
+      <w:pPr>
+        <w:pStyle w:val="Option"/>
+      </w:pPr>
+      <w:r>
+        <w:t>C. Hoại tử tủy vì rãnh đổi màu</w:t>
+      </w:r>
+    </w:p>
+    <w:p>
+      <w:pPr>
+        <w:pStyle w:val="Option"/>
+      </w:pPr>
+      <w:r>
+        <w:t>D. Răng lành mạnh chắc chắn dù đổi màu rõ</w:t>
+      </w:r>
+    </w:p>
+    <w:p>
+      <w:pPr>
+        <w:pStyle w:val="Answer"/>
+        <w:keepNext/>
+      </w:pPr>
+      <w:r>
+        <w:t>Đáp án: B</w:t>
+      </w:r>
+    </w:p>
+    <w:p>
+      <w:pPr>
+        <w:pStyle w:val="Answer"/>
+      </w:pPr>
+      <w:r>
+        <w:t>Giải thích: Bảng của nhóm đặt đổi màu vàng/nâu khu trú ở hố rãnh khi còn ướt vào giai đoạn sớm S1; ký hiệu không thay đánh giá lâm sàng đầy đủ.</w:t>
+      </w:r>
+    </w:p>
+    <w:p>
+      <w:pPr>
+        <w:pStyle w:val="Question"/>
+      </w:pPr>
+      <w:r>
+        <w:t>Câu 96. Một vệt màu ở hố rãnh biến mất sau làm sạch; sau thổi khô 5 giây không có đốm trắng, mất liên tục men hay lỗ. Theo bảng chẩn đoán của tài liệu nhóm, mô tả nào phù hợp nhất?</w:t>
+      </w:r>
+    </w:p>
+    <w:p>
+      <w:pPr>
+        <w:pStyle w:val="Option"/>
+      </w:pPr>
+      <w:r>
+        <w:t>A. Chưa có dấu lâm sàng để xếp là sâu; bề mặt phù hợp nhóm răng lành mạnh trong bảng</w:t>
+      </w:r>
+    </w:p>
+    <w:p>
+      <w:pPr>
+        <w:pStyle w:val="Option"/>
+      </w:pPr>
+      <w:r>
+        <w:t>B. Chắc chắn là S3 vì trước đó có vệt màu</w:t>
+      </w:r>
+    </w:p>
+    <w:p>
+      <w:pPr>
+        <w:pStyle w:val="Option"/>
+      </w:pPr>
+      <w:r>
+        <w:t>C. Chắc chắn viêm tủy vì phải thổi khô mới thấy rõ</w:t>
+      </w:r>
+    </w:p>
+    <w:p>
+      <w:pPr>
+        <w:pStyle w:val="Option"/>
+      </w:pPr>
+      <w:r>
+        <w:t>D. Mọi vùng hố rãnh đều có sâu ngà ẩn</w:t>
+      </w:r>
+    </w:p>
+    <w:p>
+      <w:pPr>
+        <w:pStyle w:val="Answer"/>
+        <w:keepNext/>
+      </w:pPr>
+      <w:r>
+        <w:t>Đáp án: A</w:t>
+      </w:r>
+    </w:p>
+    <w:p>
+      <w:pPr>
+        <w:pStyle w:val="Answer"/>
+      </w:pPr>
+      <w:r>
+        <w:t>Giải thích: Bảng nhóm mô tả răng lành mạnh khi không có lỗ hoặc đốm nghi mất khoáng sau thổi khô; tiếp tục theo dõi nếu nguy cơ cao.</w:t>
+      </w:r>
+    </w:p>
+    <w:p>
+      <w:pPr>
+        <w:pStyle w:val="Question"/>
+      </w:pPr>
+      <w:r>
+        <w:t>Câu 97. Một răng có nghi sâu kẽ khó nhìn trực tiếp; răng khác đã điều trị tủy có đau khi gõ và cần xem vùng quanh chóp. Theo tài liệu nhóm, cặp phim ưu tiên tương ứng là gì?</w:t>
+      </w:r>
+    </w:p>
+    <w:p>
+      <w:pPr>
+        <w:pStyle w:val="Option"/>
+      </w:pPr>
+      <w:r>
+        <w:t>A. Phim cánh cắn cho sâu kẽ; phim cận chóp cho vùng quanh chóp</w:t>
+      </w:r>
+    </w:p>
+    <w:p>
+      <w:pPr>
+        <w:pStyle w:val="Option"/>
+      </w:pPr>
+      <w:r>
+        <w:t>B. Không cần phim vì cả hai tổn thương đều nhìn được từ ngoài</w:t>
+      </w:r>
+    </w:p>
+    <w:p>
+      <w:pPr>
+        <w:pStyle w:val="Option"/>
+      </w:pPr>
+      <w:r>
+        <w:t>C. Chỉ một ảnh ngoài mặt là đủ cho cả hai</w:t>
+      </w:r>
+    </w:p>
+    <w:p>
+      <w:pPr>
+        <w:pStyle w:val="Option"/>
+      </w:pPr>
+      <w:r>
+        <w:t>D. Phim cận chóp cho sâu kẽ; phim cánh cắn cho tổn thương quanh chóp trong mọi trường hợp</w:t>
+      </w:r>
+    </w:p>
+    <w:p>
+      <w:pPr>
+        <w:pStyle w:val="Answer"/>
+        <w:keepNext/>
+      </w:pPr>
+      <w:r>
+        <w:t>Đáp án: A</w:t>
+      </w:r>
+    </w:p>
+    <w:p>
+      <w:pPr>
+        <w:pStyle w:val="Answer"/>
+      </w:pPr>
+      <w:r>
+        <w:t>Giải thích: Tài liệu nhóm nêu phim cánh cắn hữu ích cho vùng kẽ, còn phim cận chóp hỗ trợ đánh giá cuống răng và xương ổ.</w:t>
+      </w:r>
+    </w:p>
+    <w:p>
+      <w:pPr>
+        <w:pStyle w:val="Question"/>
+      </w:pPr>
+      <w:r>
+        <w:t>Câu 98. Phim cánh cắn thấy vùng thấu quang giới hạn trong men ở mặt kẽ; khám sau làm sạch chưa phát hiện lỗ. Bước diễn giải nào thận trọng nhất?</w:t>
+      </w:r>
+    </w:p>
+    <w:p>
+      <w:pPr>
+        <w:pStyle w:val="Option"/>
+      </w:pPr>
+      <w:r>
+        <w:t>A. Bỏ qua hoàn toàn vì phim không thể nhận biết mất khoáng</w:t>
+      </w:r>
+    </w:p>
+    <w:p>
+      <w:pPr>
+        <w:pStyle w:val="Option"/>
+      </w:pPr>
+      <w:r>
+        <w:t>B. Coi phim là bằng chứng chắc chắn đã lộ tủy</w:t>
+      </w:r>
+    </w:p>
+    <w:p>
+      <w:pPr>
+        <w:pStyle w:val="Option"/>
+      </w:pPr>
+      <w:r>
+        <w:t>C. Xem đây là dữ kiện gợi mất khoáng, kết hợp khám, nguy cơ và hoạt tính trước khi quyết định can thiệp</w:t>
+      </w:r>
+    </w:p>
+    <w:p>
+      <w:pPr>
+        <w:pStyle w:val="Option"/>
+      </w:pPr>
+      <w:r>
+        <w:t>D. Khoan phục hồi ngay chỉ vì có vùng tối dù chưa biết bề mặt</w:t>
+      </w:r>
+    </w:p>
+    <w:p>
+      <w:pPr>
+        <w:pStyle w:val="Answer"/>
+        <w:keepNext/>
+      </w:pPr>
+      <w:r>
+        <w:t>Đáp án: C</w:t>
+      </w:r>
+    </w:p>
+    <w:p>
+      <w:pPr>
+        <w:pStyle w:val="Answer"/>
+      </w:pPr>
+      <w:r>
+        <w:t>Giải thích: SGK cho phép dùng thông tin X-quang để hỗ trợ chẩn đoán tổn thương, đồng thời yêu cầu đánh giá nguy cơ và hoạt tính; phim không tự quyết định có lỗ.</w:t>
+      </w:r>
+    </w:p>
+    <w:p>
+      <w:pPr>
+        <w:pStyle w:val="Question"/>
+      </w:pPr>
+      <w:r>
+        <w:t>Câu 99. Một phim cho thấy thấu quang mặt bên nhưng không có phim cũ; khám hiện tại không xác định rõ bề mặt có hoạt động. Kết luận nào tránh suy diễn quá mức?</w:t>
+      </w:r>
+    </w:p>
+    <w:p>
+      <w:pPr>
+        <w:pStyle w:val="Option"/>
+      </w:pPr>
+      <w:r>
+        <w:t>A. Không cần hỏi chế độ ăn hoặc nước bọt nữa</w:t>
+      </w:r>
+    </w:p>
+    <w:p>
+      <w:pPr>
+        <w:pStyle w:val="Option"/>
+      </w:pPr>
+      <w:r>
+        <w:t>B. Một phim tự chứng minh tổn thương đã tiến nhanh trong 6 tháng</w:t>
+      </w:r>
+    </w:p>
+    <w:p>
+      <w:pPr>
+        <w:pStyle w:val="Option"/>
+      </w:pPr>
+      <w:r>
+        <w:t>C. Chưa thể suy tốc độ tiến triển từ một phim; cần thêm bệnh sử, khám và theo dõi khi phù hợp</w:t>
+      </w:r>
+    </w:p>
+    <w:p>
+      <w:pPr>
+        <w:pStyle w:val="Option"/>
+      </w:pPr>
+      <w:r>
+        <w:t>D. Thấu quang mặt bên luôn là tổn thương bất hoạt</w:t>
+      </w:r>
+    </w:p>
+    <w:p>
+      <w:pPr>
+        <w:pStyle w:val="Answer"/>
+        <w:keepNext/>
+      </w:pPr>
+      <w:r>
+        <w:t>Đáp án: C</w:t>
+      </w:r>
+    </w:p>
+    <w:p>
+      <w:pPr>
+        <w:pStyle w:val="Answer"/>
+      </w:pPr>
+      <w:r>
+        <w:t>Giải thích: Tốc độ và hoạt tính đòi hỏi bối cảnh thời gian và các dấu lâm sàng; một hình ảnh đơn lẻ là thông tin bổ sung.</w:t>
+      </w:r>
+    </w:p>
+    <w:p>
+      <w:pPr>
+        <w:pStyle w:val="Question"/>
+      </w:pPr>
+      <w:r>
+        <w:t>Câu 100. Một người có nhiều trám hở và tiền căn sâu chân răng, nhưng đốm trắng đang xem xét lại trơn bóng, ổn định qua nhiều lần khám. Kết luận nào chứa đủ hai tầng đánh giá?</w:t>
+      </w:r>
+    </w:p>
+    <w:p>
+      <w:pPr>
+        <w:pStyle w:val="Option"/>
+      </w:pPr>
+      <w:r>
+        <w:t>A. Vì đốm trắng bất hoạt nên nguy cơ toàn miệng chắc chắn thấp</w:t>
+      </w:r>
+    </w:p>
+    <w:p>
+      <w:pPr>
+        <w:pStyle w:val="Option"/>
+      </w:pPr>
+      <w:r>
+        <w:t>B. Chỉ cần nhìn màu đốm để quyết định cả nguy cơ và hoạt tính</w:t>
+      </w:r>
+    </w:p>
+    <w:p>
+      <w:pPr>
+        <w:pStyle w:val="Option"/>
+      </w:pPr>
+      <w:r>
+        <w:t>C. Người bệnh có nhiều yếu tố nguy cơ, còn đốm trắng cụ thể có thể đã bất hoạt</w:t>
+      </w:r>
+    </w:p>
+    <w:p>
+      <w:pPr>
+        <w:pStyle w:val="Option"/>
+      </w:pPr>
+      <w:r>
+        <w:t>D. Vì người bệnh nguy cơ cao nên mọi đốm trắng đều đang hoạt động</w:t>
+      </w:r>
+    </w:p>
+    <w:p>
+      <w:pPr>
+        <w:pStyle w:val="Answer"/>
+        <w:keepNext/>
+      </w:pPr>
+      <w:r>
+        <w:t>Đáp án: C</w:t>
+      </w:r>
+    </w:p>
+    <w:p>
+      <w:pPr>
+        <w:pStyle w:val="Answer"/>
+      </w:pPr>
+      <w:r>
+        <w:t>Giải thích: Nguy cơ là đánh giá ở cấp người bệnh; hoạt tính là thuộc tính của từng sang thương, có thể khác nhau.</w:t>
+      </w:r>
+    </w:p>
+    <w:p>
+      <w:pPr>
+        <w:pStyle w:val="Question"/>
+      </w:pPr>
+      <w:r>
+        <w:t>Câu 101. Trong một buổi khám, mặt A chỉ nghi ngờ đổi màu chưa xác nhận mất khoáng; mặt B có đốm trắng đục còn nguyên bề mặt; mặt C có lỗ sâu thấy rõ. Thứ tự ba nhóm chẩn đoán chung trong SGK cho A-B-C là gì?</w:t>
+      </w:r>
+    </w:p>
+    <w:p>
+      <w:pPr>
+        <w:pStyle w:val="Option"/>
+      </w:pPr>
+      <w:r>
+        <w:t>A. Cả ba đều phải gọi là lỗ sâu thực sự</w:t>
+      </w:r>
+    </w:p>
+    <w:p>
+      <w:pPr>
+        <w:pStyle w:val="Option"/>
+      </w:pPr>
+      <w:r>
+        <w:t>B. Nghi ngờ - khởi phát - lỗ sâu thực sự</w:t>
+      </w:r>
+    </w:p>
+    <w:p>
+      <w:pPr>
+        <w:pStyle w:val="Option"/>
+      </w:pPr>
+      <w:r>
+        <w:t>C. Khởi phát - lỗ sâu thực sự - nghi ngờ</w:t>
+      </w:r>
+    </w:p>
+    <w:p>
+      <w:pPr>
+        <w:pStyle w:val="Option"/>
+      </w:pPr>
+      <w:r>
+        <w:t>D. Lỗ sâu thực sự - nghi ngờ - khởi phát</w:t>
+      </w:r>
+    </w:p>
+    <w:p>
+      <w:pPr>
+        <w:pStyle w:val="Answer"/>
+        <w:keepNext/>
+      </w:pPr>
+      <w:r>
+        <w:t>Đáp án: B</w:t>
+      </w:r>
+    </w:p>
+    <w:p>
+      <w:pPr>
+        <w:pStyle w:val="Answer"/>
+      </w:pPr>
+      <w:r>
+        <w:t>Giải thích: SGK chia chung thành sâu răng nghi ngờ, khởi phát dạng đốm trắng đục và lỗ sâu thực sự; mức chắc chắn tăng theo dấu hiện diện.</w:t>
+      </w:r>
+    </w:p>
+    <w:p>
+      <w:pPr>
+        <w:pStyle w:val="Question"/>
+      </w:pPr>
+      <w:r>
+        <w:t>Câu 102. Một vùng kẽ đổi màu nhẹ, khó quan sát, người bệnh nguy cơ cao nhưng chưa rõ có lỗ hay không. Lựa chọn nào đi đúng thứ tự chẩn đoán của bài học?</w:t>
+      </w:r>
+    </w:p>
+    <w:p>
+      <w:pPr>
+        <w:pStyle w:val="Option"/>
+      </w:pPr>
+      <w:r>
+        <w:t>A. Làm sạch, khám kỹ, bổ sung hình ảnh phù hợp khi cần rồi mới xác định mức tổn thương và hoạt tính</w:t>
+      </w:r>
+    </w:p>
+    <w:p>
+      <w:pPr>
+        <w:pStyle w:val="Option"/>
+      </w:pPr>
+      <w:r>
+        <w:t>B. Điều trị tủy trước khi kiểm tra bề mặt và phim</w:t>
+      </w:r>
+    </w:p>
+    <w:p>
+      <w:pPr>
+        <w:pStyle w:val="Option"/>
+      </w:pPr>
+      <w:r>
+        <w:t>C. Bỏ qua vùng kẽ vì không có đau tự nhiên</w:t>
+      </w:r>
+    </w:p>
+    <w:p>
+      <w:pPr>
+        <w:pStyle w:val="Option"/>
+      </w:pPr>
+      <w:r>
+        <w:t>D. Coi nguy cơ cao là bằng chứng đủ để kết luận lỗ sâu ngà</w:t>
+      </w:r>
+    </w:p>
+    <w:p>
+      <w:pPr>
+        <w:pStyle w:val="Answer"/>
+        <w:keepNext/>
+      </w:pPr>
+      <w:r>
+        <w:t>Đáp án: A</w:t>
+      </w:r>
+    </w:p>
+    <w:p>
+      <w:pPr>
+        <w:pStyle w:val="Answer"/>
+      </w:pPr>
+      <w:r>
+        <w:t>Giải thích: Nguy cơ làm tăng nghi ngờ, nhưng chẩn đoán bề mặt vẫn cần bệnh sử, khám và thông tin bổ sung khi chưa đủ.</w:t>
+      </w:r>
+    </w:p>
+    <w:p>
+      <w:pPr>
+        <w:pStyle w:val="Question"/>
+      </w:pPr>
+      <w:r>
+        <w:t>Câu 103. Một đốm men còn nguyên bề mặt chỉ xuất hiện sau thổi khô. Người khám định ấn mạnh thám trâm để “xác nhận” có lỗ. Cách điều chỉnh nào phù hợp nhất với tài liệu nhóm?</w:t>
+      </w:r>
+    </w:p>
+    <w:p>
+      <w:pPr>
+        <w:pStyle w:val="Option"/>
+      </w:pPr>
+      <w:r>
+        <w:t>A. Khoan bỏ toàn bộ men quanh đốm trước khi đánh giá nguy cơ</w:t>
+      </w:r>
+    </w:p>
+    <w:p>
+      <w:pPr>
+        <w:pStyle w:val="Option"/>
+      </w:pPr>
+      <w:r>
+        <w:t>B. Ấn sâu hơn vì phải tạo lỗ mới biết sâu men</w:t>
+      </w:r>
+    </w:p>
+    <w:p>
+      <w:pPr>
+        <w:pStyle w:val="Option"/>
+      </w:pPr>
+      <w:r>
+        <w:t>C. Chỉ căn cứ cảm giác đau do thám trâm gây ra để xác định ngà bị nhiễm trùng</w:t>
+      </w:r>
+    </w:p>
+    <w:p>
+      <w:pPr>
+        <w:pStyle w:val="Option"/>
+      </w:pPr>
+      <w:r>
+        <w:t>D. Dừng ấn mạnh, ưu tiên quan sát bề mặt sạch và thăm nhẹ nếu cần</w:t>
+      </w:r>
+    </w:p>
+    <w:p>
+      <w:pPr>
+        <w:pStyle w:val="Answer"/>
+        <w:keepNext/>
+      </w:pPr>
+      <w:r>
+        <w:t>Đáp án: D</w:t>
+      </w:r>
+    </w:p>
+    <w:p>
+      <w:pPr>
+        <w:pStyle w:val="Answer"/>
+      </w:pPr>
+      <w:r>
+        <w:t>Giải thích: Tài liệu nhóm yêu cầu thao tác thám trâm nhẹ, tránh gây tổn thương; dấu trắng sau thổi khô có thể là giai đoạn sớm chưa tạo lỗ.</w:t>
+      </w:r>
+    </w:p>
+    <w:p>
+      <w:pPr>
+        <w:pStyle w:val="Question"/>
+      </w:pPr>
+      <w:r>
+        <w:t>Câu 104. Ở một sang thương đã vượt đường nối men-ngà, người học cần sắp xếp: acid phá khoáng mở đường, vi khuẩn vào ống ngà, collagen khuôn ngà tổn thương. Trình tự nào sát SGK nhất?</w:t>
+      </w:r>
+    </w:p>
+    <w:p>
+      <w:pPr>
+        <w:pStyle w:val="Option"/>
+      </w:pPr>
+      <w:r>
+        <w:t>A. Collagen hoàn toàn phân hủy trước khi có acid hay vi khuẩn</w:t>
+      </w:r>
+    </w:p>
+    <w:p>
+      <w:pPr>
+        <w:pStyle w:val="Option"/>
+      </w:pPr>
+      <w:r>
+        <w:t>B. Tủy hoại tử trước rồi acid mới xuất hiện ở men</w:t>
+      </w:r>
+    </w:p>
+    <w:p>
+      <w:pPr>
+        <w:pStyle w:val="Option"/>
+      </w:pPr>
+      <w:r>
+        <w:t>C. Acid làm tổn thương cấu trúc ngà → vi khuẩn xâm nhập ống ngà → collagen bị tổn thương/phân hủy</w:t>
+      </w:r>
+    </w:p>
+    <w:p>
+      <w:pPr>
+        <w:pStyle w:val="Option"/>
+      </w:pPr>
+      <w:r>
+        <w:t>D. Sealant hố rãnh tạo ra vi khuẩn trong ống ngà</w:t>
+      </w:r>
+    </w:p>
+    <w:p>
+      <w:pPr>
+        <w:pStyle w:val="Answer"/>
+        <w:keepNext/>
+      </w:pPr>
+      <w:r>
+        <w:t>Đáp án: C</w:t>
+      </w:r>
+    </w:p>
+    <w:p>
+      <w:pPr>
+        <w:pStyle w:val="Answer"/>
+      </w:pPr>
+      <w:r>
+        <w:t>Giải thích: SGK mô tả acid gây phá hủy mở đường cho một lượng vi khuẩn vào ống ngà, sau đó khuôn ngà yếu đi và collagen bị tổn thương.</w:t>
+      </w:r>
+    </w:p>
+    <w:p>
+      <w:pPr>
+        <w:pStyle w:val="Question"/>
+      </w:pPr>
+      <w:r>
+        <w:t>Câu 105. Một tiêu bản sâu ngà cho thấy tổn thương không còn giới hạn trong lòng ống ngà mà lan tới vùng giữa các ống. Theo mô tả tiến triển của SGK, cấu trúc khoáng nào đang bị hòa tan?</w:t>
+      </w:r>
+    </w:p>
+    <w:p>
+      <w:pPr>
+        <w:pStyle w:val="Option"/>
+      </w:pPr>
+      <w:r>
+        <w:t>A. Chỉ dây thần kinh tủy mà không ảnh hưởng khoáng</w:t>
+      </w:r>
+    </w:p>
+    <w:p>
+      <w:pPr>
+        <w:pStyle w:val="Option"/>
+      </w:pPr>
+      <w:r>
+        <w:t>B. Chỉ men răng ở bề mặt, không có biến đổi ngà</w:t>
+      </w:r>
+    </w:p>
+    <w:p>
+      <w:pPr>
+        <w:pStyle w:val="Option"/>
+      </w:pPr>
+      <w:r>
+        <w:t>C. Tinh thể quanh ống ngà và ngà gian ống</w:t>
+      </w:r>
+    </w:p>
+    <w:p>
+      <w:pPr>
+        <w:pStyle w:val="Option"/>
+      </w:pPr>
+      <w:r>
+        <w:t>D. Chỉ cement chân răng dù tổn thương ở thân răng</w:t>
+      </w:r>
+    </w:p>
+    <w:p>
+      <w:pPr>
+        <w:pStyle w:val="Answer"/>
+        <w:keepNext/>
+      </w:pPr>
+      <w:r>
+        <w:t>Đáp án: C</w:t>
+      </w:r>
+    </w:p>
+    <w:p>
+      <w:pPr>
+        <w:pStyle w:val="Answer"/>
+      </w:pPr>
+      <w:r>
+        <w:t>Giải thích: Sau tổn thương collagen, SGK nêu hòa tan tinh thể quanh ống ngà, ngà gian ống và các thành phần khác.</w:t>
+      </w:r>
+    </w:p>
+    <w:p>
+      <w:pPr>
+        <w:pStyle w:val="Question"/>
+      </w:pPr>
+      <w:r>
+        <w:t>Câu 106. Ở một răng sâu tiến gần tủy, hình ảnh mô học gợi kết tủa khoáng làm bít ống ngà và một lớp ngà mới phía tủy. Ghép tên hai phản ứng theo tài liệu nhóm thế nào?</w:t>
+      </w:r>
+    </w:p>
+    <w:p>
+      <w:pPr>
+        <w:pStyle w:val="Option"/>
+      </w:pPr>
+      <w:r>
+        <w:t>A. Xơ cứng ống ngà và tạo ngà thứ ba</w:t>
+      </w:r>
+    </w:p>
+    <w:p>
+      <w:pPr>
+        <w:pStyle w:val="Option"/>
+      </w:pPr>
+      <w:r>
+        <w:t>B. Mất khoáng men và tiêu chóp chân răng</w:t>
+      </w:r>
+    </w:p>
+    <w:p>
+      <w:pPr>
+        <w:pStyle w:val="Option"/>
+      </w:pPr>
+      <w:r>
+        <w:t>C. Sâu kẽ và sealant hố rãnh</w:t>
+      </w:r>
+    </w:p>
+    <w:p>
+      <w:pPr>
+        <w:pStyle w:val="Option"/>
+      </w:pPr>
+      <w:r>
+        <w:t>D. Nhiễm fluor và thiểu sản men</w:t>
+      </w:r>
+    </w:p>
+    <w:p>
+      <w:pPr>
+        <w:pStyle w:val="Answer"/>
+        <w:keepNext/>
+      </w:pPr>
+      <w:r>
+        <w:t>Đáp án: A</w:t>
+      </w:r>
+    </w:p>
+    <w:p>
+      <w:pPr>
+        <w:pStyle w:val="Answer"/>
+      </w:pPr>
+      <w:r>
+        <w:t>Giải thích: Ngà xơ cứng giảm tính thấm ống ngà; tài liệu nhóm bổ sung ngà thứ ba do nguyên bào tạo ngà tạo ra gần tủy.</w:t>
+      </w:r>
+    </w:p>
+    <w:p>
+      <w:pPr>
+        <w:pStyle w:val="Question"/>
+      </w:pPr>
+      <w:r>
+        <w:t>Câu 107. Khi khảo sát đáy sang thương sâu ngà, một vùng ngà còn khung collagen, còn phản ứng cảm giác và không có bằng chứng vi khuẩn xâm nhập nhiều. Theo Bảng 1.1 SGK, vùng đó gần nhất với gì?</w:t>
+      </w:r>
+    </w:p>
+    <w:p>
+      <w:pPr>
+        <w:pStyle w:val="Option"/>
+      </w:pPr>
+      <w:r>
+        <w:t>A. Men răng mới mọc chưa trưởng thành</w:t>
+      </w:r>
+    </w:p>
+    <w:p>
+      <w:pPr>
+        <w:pStyle w:val="Option"/>
+      </w:pPr>
+      <w:r>
+        <w:t>B. Ngà nhiễm trùng hoại tử ở lớp ngoài, không tái khoáng</w:t>
+      </w:r>
+    </w:p>
+    <w:p>
+      <w:pPr>
+        <w:pStyle w:val="Option"/>
+      </w:pPr>
+      <w:r>
+        <w:t>C. Mảng bám vi khuẩn nằm ngoài răng</w:t>
+      </w:r>
+    </w:p>
+    <w:p>
+      <w:pPr>
+        <w:pStyle w:val="Option"/>
+      </w:pPr>
+      <w:r>
+        <w:t>D. Ngà bị ảnh hưởng ở lớp trong, có tiềm năng tái khoáng</w:t>
+      </w:r>
+    </w:p>
+    <w:p>
+      <w:pPr>
+        <w:pStyle w:val="Answer"/>
+        <w:keepNext/>
+      </w:pPr>
+      <w:r>
+        <w:t>Đáp án: D</w:t>
+      </w:r>
+    </w:p>
+    <w:p>
+      <w:pPr>
+        <w:pStyle w:val="Answer"/>
+      </w:pPr>
+      <w:r>
+        <w:t>Giải thích: Ngà bị ảnh hưởng còn sống, có cảm giác và có khả năng tái khoáng khi điều kiện sinh học phù hợp.</w:t>
+      </w:r>
+    </w:p>
+    <w:p>
+      <w:pPr>
+        <w:pStyle w:val="Question"/>
+      </w:pPr>
+      <w:r>
+        <w:t>Câu 108. Trong sơ đồ sâu hố rãnh mặt nhai lan từ men vào ngà của bài học, đường xâm nhập hẹp ở mặt men, rộng tại đường nối men-ngà rồi thu lại về hướng tủy. Cách giải thích hình học nào phù hợp với sơ đồ này?</w:t>
+      </w:r>
+    </w:p>
+    <w:p>
+      <w:pPr>
+        <w:pStyle w:val="Option"/>
+      </w:pPr>
+      <w:r>
+        <w:t>A. Nón sâu men có đáy ở đường nối men-ngà; nón sâu ngà cũng có đáy tại đó nhưng đỉnh hướng tủy</w:t>
+      </w:r>
+    </w:p>
+    <w:p>
+      <w:pPr>
+        <w:pStyle w:val="Option"/>
+      </w:pPr>
+      <w:r>
+        <w:t>B. Sâu men và sâu ngà cùng bắt đầu tại lỗ chóp chân răng</w:t>
+      </w:r>
+    </w:p>
+    <w:p>
+      <w:pPr>
+        <w:pStyle w:val="Option"/>
+      </w:pPr>
+      <w:r>
+        <w:t>C. Đường nối men-ngà không liên quan hướng lan của tổn thương</w:t>
+      </w:r>
+    </w:p>
+    <w:p>
+      <w:pPr>
+        <w:pStyle w:val="Option"/>
+      </w:pPr>
+      <w:r>
+        <w:t>D. Cả hai nón đều có đỉnh ở đường nối men-ngà</w:t>
+      </w:r>
+    </w:p>
+    <w:p>
+      <w:pPr>
+        <w:pStyle w:val="Answer"/>
+        <w:keepNext/>
+      </w:pPr>
+      <w:r>
+        <w:t>Đáp án: A</w:t>
+      </w:r>
+    </w:p>
+    <w:p>
+      <w:pPr>
+        <w:pStyle w:val="Answer"/>
+      </w:pPr>
+      <w:r>
+        <w:t>Giải thích: Trong sơ đồ hình nón của SGK, hai phần có đáy tại đường nối men-ngà: phần men hướng đỉnh ra mặt ngoài, phần ngà hướng đỉnh vào tủy. Đây là mô hình minh họa của kiểu tổn thương được hỏi, không áp cứng cho mọi mặt răng.</w:t>
+      </w:r>
+    </w:p>
+    <w:p>
+      <w:pPr>
+        <w:pStyle w:val="Question"/>
+      </w:pPr>
+      <w:r>
+        <w:t>Câu 109. Một lỗ sâu ngà được giữ sạch, không còn mảng bám đọng; sau vài tháng đáy ngà sậm màu nhưng cứng hơn và người bệnh bớt ê. Suy luận nào phù hợp ví dụ của SGK?</w:t>
+      </w:r>
+    </w:p>
+    <w:p>
+      <w:pPr>
+        <w:pStyle w:val="Option"/>
+      </w:pPr>
+      <w:r>
+        <w:t>A. Màu sậm tự nó chứng minh tổn thương vẫn lan nhanh</w:t>
+      </w:r>
+    </w:p>
+    <w:p>
+      <w:pPr>
+        <w:pStyle w:val="Option"/>
+      </w:pPr>
+      <w:r>
+        <w:t>B. Hết ê buốt đủ để khẳng định không còn lỗ sâu mất chất</w:t>
+      </w:r>
+    </w:p>
+    <w:p>
+      <w:pPr>
+        <w:pStyle w:val="Option"/>
+      </w:pPr>
+      <w:r>
+        <w:t>C. Ngà cứng hơn chắc chắn do tủy hoại tử</w:t>
+      </w:r>
+    </w:p>
+    <w:p>
+      <w:pPr>
+        <w:pStyle w:val="Option"/>
+      </w:pPr>
+      <w:r>
+        <w:t>D. Có thể sang thương đã ngừng tiến triển và ngà bên dưới tái khoáng; màu sậm đơn độc không chứng minh đang hoạt động</w:t>
+      </w:r>
+    </w:p>
+    <w:p>
+      <w:pPr>
+        <w:pStyle w:val="Answer"/>
+        <w:keepNext/>
+      </w:pPr>
+      <w:r>
+        <w:t>Đáp án: D</w:t>
+      </w:r>
+    </w:p>
+    <w:p>
+      <w:pPr>
+        <w:pStyle w:val="Answer"/>
+      </w:pPr>
+      <w:r>
+        <w:t>Giải thích: SGK Hình 1.3 mô tả ngà sậm và cứng hơn sau kiểm soát mảng bám; hoạt tính không được suy chỉ từ màu.</w:t>
+      </w:r>
+    </w:p>
+    <w:p>
+      <w:pPr>
+        <w:pStyle w:val="Question"/>
+      </w:pPr>
+      <w:r>
+        <w:t>Câu 110. Một vùng sâu ngà đã ổn định sau kiểm soát mảng bám nhưng vẫn còn lỗ mất chất giữ thức ăn. Kết luận nào giữ đúng cả hai ý trong SGK?</w:t>
+      </w:r>
+    </w:p>
+    <w:p>
+      <w:pPr>
+        <w:pStyle w:val="Option"/>
+      </w:pPr>
+      <w:r>
+        <w:t>A. Khi ngà cứng lên, hình dạng thân răng tự tái tạo hoàn toàn</w:t>
+      </w:r>
+    </w:p>
+    <w:p>
+      <w:pPr>
+        <w:pStyle w:val="Option"/>
+      </w:pPr>
+      <w:r>
+        <w:t>B. Hoạt tính có thể giảm, song cần đánh giá nhu cầu phục hồi lỗ mất chất và tiếp tục kiểm soát nguy cơ</w:t>
+      </w:r>
+    </w:p>
+    <w:p>
+      <w:pPr>
+        <w:pStyle w:val="Option"/>
+      </w:pPr>
+      <w:r>
+        <w:t>C. Mọi lỗ sâu đã ổn định đều bắt buộc điều trị tủy</w:t>
+      </w:r>
+    </w:p>
+    <w:p>
+      <w:pPr>
+        <w:pStyle w:val="Option"/>
+      </w:pPr>
+      <w:r>
+        <w:t>D. Chỉ cần trám là căn nguyên bệnh đã tự biến mất</w:t>
+      </w:r>
+    </w:p>
+    <w:p>
+      <w:pPr>
+        <w:pStyle w:val="Answer"/>
+        <w:keepNext/>
+      </w:pPr>
+      <w:r>
+        <w:t>Đáp án: B</w:t>
+      </w:r>
+    </w:p>
+    <w:p>
+      <w:pPr>
+        <w:pStyle w:val="Answer"/>
+      </w:pPr>
+      <w:r>
+        <w:t>Giải thích: SGK vừa mô tả khả năng ngà dưới tổn thương tái khoáng, vừa nhấn mạnh phục hồi tổn thương có lỗ và xử lý căn nguyên.</w:t>
+      </w:r>
+    </w:p>
+    <w:p>
+      <w:pPr>
+        <w:pStyle w:val="Question"/>
+      </w:pPr>
+      <w:r>
+        <w:t>Câu 111. Một lỗ sâu lớn thấy ngà mềm nhưng người bệnh hiện không đau tự nhiên. Trước khi chọn vật liệu phục hồi, suy luận nào thận trọng nhất?</w:t>
+      </w:r>
+    </w:p>
+    <w:p>
+      <w:pPr>
+        <w:pStyle w:val="Option"/>
+      </w:pPr>
+      <w:r>
+        <w:t>A. Không đau tự nhiên chứng minh răng chắc chắn chưa vào ngà</w:t>
+      </w:r>
+    </w:p>
+    <w:p>
+      <w:pPr>
+        <w:pStyle w:val="Option"/>
+      </w:pPr>
+      <w:r>
+        <w:t>B. Vẫn đánh giá độ sâu, triệu chứng và tình trạng tủy; không kết luận tủy lành chỉ từ việc chưa đau tự nhiên</w:t>
+      </w:r>
+    </w:p>
+    <w:p>
+      <w:pPr>
+        <w:pStyle w:val="Option"/>
+      </w:pPr>
+      <w:r>
+        <w:t>C. Mọi lỗ sâu lớn không đau đều đã hoại tử tủy</w:t>
+      </w:r>
+    </w:p>
+    <w:p>
+      <w:pPr>
+        <w:pStyle w:val="Option"/>
+      </w:pPr>
+      <w:r>
+        <w:t>D. Không đau tự nhiên đồng nghĩa không cần khám lỗ sâu</w:t>
+      </w:r>
+    </w:p>
+    <w:p>
+      <w:pPr>
+        <w:pStyle w:val="Answer"/>
+        <w:keepNext/>
+      </w:pPr>
+      <w:r>
+        <w:t>Đáp án: B</w:t>
+      </w:r>
+    </w:p>
+    <w:p>
+      <w:pPr>
+        <w:pStyle w:val="Answer"/>
+      </w:pPr>
+      <w:r>
+        <w:t>Giải thích: Độ sâu tổn thương và sức khỏe tủy cần được khám riêng; triệu chứng âm tính đơn độc không quyết định chẩn đoán.</w:t>
+      </w:r>
+    </w:p>
+    <w:p>
+      <w:pPr>
+        <w:pStyle w:val="Question"/>
+      </w:pPr>
+      <w:r>
+        <w:t>Câu 112. Răng A ê thoáng qua khi ăn ngọt rồi hết ngay; răng B đau tự nhiên về đêm và kéo dài sau kích thích lạnh. Răng nào cần ưu tiên đánh giá bệnh lý tủy hơn?</w:t>
+      </w:r>
+    </w:p>
+    <w:p>
+      <w:pPr>
+        <w:pStyle w:val="Option"/>
+      </w:pPr>
+      <w:r>
+        <w:t>A. Không răng nào cần hỏi bệnh sử hay thử tủy</w:t>
+      </w:r>
+    </w:p>
+    <w:p>
+      <w:pPr>
+        <w:pStyle w:val="Option"/>
+      </w:pPr>
+      <w:r>
+        <w:t>B. Cả hai chắc chắn chỉ là sâu men chưa tạo lỗ</w:t>
+      </w:r>
+    </w:p>
+    <w:p>
+      <w:pPr>
+        <w:pStyle w:val="Option"/>
+      </w:pPr>
+      <w:r>
+        <w:t>C. Răng A, vì đau do ngọt luôn chứng minh tủy hoại tử</w:t>
+      </w:r>
+    </w:p>
+    <w:p>
+      <w:pPr>
+        <w:pStyle w:val="Option"/>
+      </w:pPr>
+      <w:r>
+        <w:t>D. Răng B, vì kiểu đau tự nhiên/kéo dài gợi biến chứng tủy hơn</w:t>
+      </w:r>
+    </w:p>
+    <w:p>
+      <w:pPr>
+        <w:pStyle w:val="Answer"/>
+        <w:keepNext/>
+      </w:pPr>
+      <w:r>
+        <w:t>Đáp án: D</w:t>
+      </w:r>
+    </w:p>
+    <w:p>
+      <w:pPr>
+        <w:pStyle w:val="Answer"/>
+      </w:pPr>
+      <w:r>
+        <w:t>Giải thích: Tài liệu nhóm dùng đặc điểm đau tự nhiên, về đêm và kéo dài để gợi bệnh tủy; cần khám xác nhận, không chẩn đoán chỉ từ một triệu chứng.</w:t>
+      </w:r>
+    </w:p>
+    <w:p>
+      <w:pPr>
+        <w:pStyle w:val="Question"/>
+      </w:pPr>
+      <w:r>
+        <w:t>Câu 113. Một răng sâu có tủy hoại tử và phim cận chóp gợi tổn thương quanh chóp, nhưng hiện không sưng mặt, không sốt. Một sinh viên kết luận bệnh nhân đã viêm mô tế bào và nhiễm khuẩn huyết. Chỉnh suy luận này thế nào?</w:t>
+      </w:r>
+    </w:p>
+    <w:p>
+      <w:pPr>
+        <w:pStyle w:val="Option"/>
+      </w:pPr>
+      <w:r>
+        <w:t>A. Hiện có dữ kiện gợi biến chứng quanh chóp; chưa đủ dấu để kết luận đã lan mô mềm hay toàn thân</w:t>
+      </w:r>
+    </w:p>
+    <w:p>
+      <w:pPr>
+        <w:pStyle w:val="Option"/>
+      </w:pPr>
+      <w:r>
+        <w:t>B. Chỉ cần có vùng thấu quang quanh chóp là chắc chắn nhiễm khuẩn huyết</w:t>
+      </w:r>
+    </w:p>
+    <w:p>
+      <w:pPr>
+        <w:pStyle w:val="Option"/>
+      </w:pPr>
+      <w:r>
+        <w:t>C. Không sưng mặt chứng minh không hề có tổn thương quanh chóp</w:t>
+      </w:r>
+    </w:p>
+    <w:p>
+      <w:pPr>
+        <w:pStyle w:val="Option"/>
+      </w:pPr>
+      <w:r>
+        <w:t>D. Tủy hoại tử luôn đồng nghĩa đã viêm mô tế bào ở mặt</w:t>
+      </w:r>
+    </w:p>
+    <w:p>
+      <w:pPr>
+        <w:pStyle w:val="Answer"/>
+        <w:keepNext/>
+      </w:pPr>
+      <w:r>
+        <w:t>Đáp án: A</w:t>
+      </w:r>
+    </w:p>
+    <w:p>
+      <w:pPr>
+        <w:pStyle w:val="Answer"/>
+      </w:pPr>
+      <w:r>
+        <w:t>Giải thích: SGK mô tả các tầng lan nhiễm khuẩn từ tủy đến quanh chóp, rồi mới có thể đến mô mềm hoặc toàn thân. Phim gợi tổn thương quanh chóp không tự chứng minh các tầng biến chứng xa khi thiếu dấu lâm sàng tương ứng.</w:t>
+      </w:r>
+    </w:p>
+    <w:p>
+      <w:pPr>
+        <w:pStyle w:val="Question"/>
+      </w:pPr>
+      <w:r>
+        <w:t>Câu 114. Một người có răng từng đau nhiều, nay ít đau nhưng có đường rò mủ ở ngách lợi cạnh răng sâu lớn. Theo chuỗi biến chứng tài liệu nhóm, tình huống này gợi nhất điều gì?</w:t>
+      </w:r>
+    </w:p>
+    <w:p>
+      <w:pPr>
+        <w:pStyle w:val="Option"/>
+      </w:pPr>
+      <w:r>
+        <w:t>A. Nhiễm fluor răng đối xứng</w:t>
+      </w:r>
+    </w:p>
+    <w:p>
+      <w:pPr>
+        <w:pStyle w:val="Option"/>
+      </w:pPr>
+      <w:r>
+        <w:t>B. Sâu men mới chớm không có liên quan tủy</w:t>
+      </w:r>
+    </w:p>
+    <w:p>
+      <w:pPr>
+        <w:pStyle w:val="Option"/>
+      </w:pPr>
+      <w:r>
+        <w:t>C. Tổn thương quanh chóp mạn sau hoại tử tủy, cần khám xác định</w:t>
+      </w:r>
+    </w:p>
+    <w:p>
+      <w:pPr>
+        <w:pStyle w:val="Option"/>
+      </w:pPr>
+      <w:r>
+        <w:t>D. Quá trình trưởng thành men sau mọc bình thường</w:t>
+      </w:r>
+    </w:p>
+    <w:p>
+      <w:pPr>
+        <w:pStyle w:val="Answer"/>
+        <w:keepNext/>
+      </w:pPr>
+      <w:r>
+        <w:t>Đáp án: C</w:t>
+      </w:r>
+    </w:p>
+    <w:p>
+      <w:pPr>
+        <w:pStyle w:val="Answer"/>
+      </w:pPr>
+      <w:r>
+        <w:t>Giải thích: Tài liệu nhóm nêu rò mủ mạn có thể xuất hiện khi nhiễm khuẩn từ tủy hoại tử kéo dài ở vùng quanh chóp.</w:t>
+      </w:r>
+    </w:p>
+    <w:p>
+      <w:pPr>
+        <w:pStyle w:val="Question"/>
+      </w:pPr>
+      <w:r>
+        <w:t>Câu 115. Sau sâu răng kéo dài, một người có tủy hoại tử, áp xe quanh chóp rồi sưng lan mô mặt. Chuỗi giải thích nào phù hợp SGK nhất?</w:t>
+      </w:r>
+    </w:p>
+    <w:p>
+      <w:pPr>
+        <w:pStyle w:val="Option"/>
+      </w:pPr>
+      <w:r>
+        <w:t>A. Sưng mặt chứng minh mọi sang thương men đã vào tủy</w:t>
+      </w:r>
+    </w:p>
+    <w:p>
+      <w:pPr>
+        <w:pStyle w:val="Option"/>
+      </w:pPr>
+      <w:r>
+        <w:t>B. Vi khuẩn có thể lan qua lỗ chóp đến mô quanh chóp rồi mô mềm; đây là biến chứng cần đánh giá, không phải diễn tiến bắt buộc của mọi lỗ sâu</w:t>
+      </w:r>
+    </w:p>
+    <w:p>
+      <w:pPr>
+        <w:pStyle w:val="Option"/>
+      </w:pPr>
+      <w:r>
+        <w:t>C. Men răng tự lan vi khuẩn trực tiếp theo máu trước khi có bệnh tủy</w:t>
+      </w:r>
+    </w:p>
+    <w:p>
+      <w:pPr>
+        <w:pStyle w:val="Option"/>
+      </w:pPr>
+      <w:r>
+        <w:t>D. Áp xe quanh chóp chỉ xuất hiện khi không có lỗ sâu nào</w:t>
+      </w:r>
+    </w:p>
+    <w:p>
+      <w:pPr>
+        <w:pStyle w:val="Answer"/>
+        <w:keepNext/>
+      </w:pPr>
+      <w:r>
+        <w:t>Đáp án: B</w:t>
+      </w:r>
+    </w:p>
+    <w:p>
+      <w:pPr>
+        <w:pStyle w:val="Answer"/>
+      </w:pPr>
+      <w:r>
+        <w:t>Giải thích: SGK mô tả diễn tiến từ tổn thương tủy qua lỗ chóp và có thể tới mô mềm, xương; mức lan rộng không xảy ra ở mọi bệnh nhân.</w:t>
+      </w:r>
+    </w:p>
+    <w:p>
+      <w:pPr>
+        <w:pStyle w:val="Question"/>
+      </w:pPr>
+      <w:r>
+        <w:t>Câu 116. Một răng cối có hố rãnh sâu chưa tổn thương; các răng kế bên lại đọng mảng bám ở kẽ dù mặt nhai sạch. Cặp biện pháp nào nhắm đúng hai vị trí theo SGK?</w:t>
+      </w:r>
+    </w:p>
+    <w:p>
+      <w:pPr>
+        <w:pStyle w:val="Option"/>
+      </w:pPr>
+      <w:r>
+        <w:t>A. Điều trị tủy tất cả răng còn nguyên vẹn</w:t>
+      </w:r>
+    </w:p>
+    <w:p>
+      <w:pPr>
+        <w:pStyle w:val="Option"/>
+      </w:pPr>
+      <w:r>
+        <w:t>B. Chỉ trám bít hố rãnh rồi bỏ qua các mặt kẽ</w:t>
+      </w:r>
+    </w:p>
+    <w:p>
+      <w:pPr>
+        <w:pStyle w:val="Option"/>
+      </w:pPr>
+      <w:r>
+        <w:t>C. Chỉ dùng chỉ nha khoa để thay luôn trám bít hố rãnh sâu</w:t>
+      </w:r>
+    </w:p>
+    <w:p>
+      <w:pPr>
+        <w:pStyle w:val="Option"/>
+      </w:pPr>
+      <w:r>
+        <w:t>D. Đánh giá trám bít hố rãnh và hướng dẫn làm sạch kẽ bằng chỉ/bàn chải kẽ phù hợp</w:t>
+      </w:r>
+    </w:p>
+    <w:p>
+      <w:pPr>
+        <w:pStyle w:val="Answer"/>
+        <w:keepNext/>
+      </w:pPr>
+      <w:r>
+        <w:t>Đáp án: D</w:t>
+      </w:r>
+    </w:p>
+    <w:p>
+      <w:pPr>
+        <w:pStyle w:val="Answer"/>
+      </w:pPr>
+      <w:r>
+        <w:t>Giải thích: Sealant cô lập hố rãnh mặt nhai; chỉ/bàn chải kẽ xử lý các mặt bên mà chải thông thường khó tiếp cận.</w:t>
+      </w:r>
+    </w:p>
+    <w:p>
+      <w:pPr>
+        <w:pStyle w:val="Question"/>
+      </w:pPr>
+      <w:r>
+        <w:t>Câu 117. Một người lớn tụt nướu, trước đây đã sâu chân răng, nay có thêm vùng cổ răng đổi màu. Thông tin nào cần được ưu tiên khi khám vùng này?</w:t>
+      </w:r>
+    </w:p>
+    <w:p>
+      <w:pPr>
+        <w:pStyle w:val="Option"/>
+      </w:pPr>
+      <w:r>
+        <w:t>A. Chỉ khám hố rãnh mặt nhai vì tụt nướu không liên quan sâu răng</w:t>
+      </w:r>
+    </w:p>
+    <w:p>
+      <w:pPr>
+        <w:pStyle w:val="Option"/>
+      </w:pPr>
+      <w:r>
+        <w:t>B. Chỉ xem màu và tự kết luận mọi vùng sậm đều là sâu đang hoạt động</w:t>
+      </w:r>
+    </w:p>
+    <w:p>
+      <w:pPr>
+        <w:pStyle w:val="Option"/>
+      </w:pPr>
+      <w:r>
+        <w:t>C. Bề mặt chân răng lộ, mảng bám, độ cứng tổn thương và hoạt tính, bên cạnh nguy cơ toàn miệng</w:t>
+      </w:r>
+    </w:p>
+    <w:p>
+      <w:pPr>
+        <w:pStyle w:val="Option"/>
+      </w:pPr>
+      <w:r>
+        <w:t>D. Kết luận chắc chắn nhiễm fluor chỉ vì vùng cổ đổi màu</w:t>
+      </w:r>
+    </w:p>
+    <w:p>
+      <w:pPr>
+        <w:pStyle w:val="Answer"/>
+        <w:keepNext/>
+      </w:pPr>
+      <w:r>
+        <w:t>Đáp án: C</w:t>
+      </w:r>
+    </w:p>
+    <w:p>
+      <w:pPr>
+        <w:pStyle w:val="Answer"/>
+      </w:pPr>
+      <w:r>
+        <w:t>Giải thích: SGK xem tụt nướu và tiền căn sâu chân răng là dấu nguy cơ người lớn; vùng đổi màu cần khám bề mặt để phân biệt hoạt tính và nguyên nhân.</w:t>
+      </w:r>
+    </w:p>
+    <w:p>
+      <w:pPr>
+        <w:pStyle w:val="Question"/>
+      </w:pPr>
+      <w:r>
+        <w:t>Câu 118. Một sinh viên đọc SGK thấy chlorhexidine trong phác đồ sâu răng trầm trọng, rồi đề nghị mọi bệnh nhân có đốm trắng tự dùng hằng ngày lâu dài. Cách sửa nào phù hợp nhất?</w:t>
+      </w:r>
+    </w:p>
+    <w:p>
+      <w:pPr>
+        <w:pStyle w:val="Option"/>
+      </w:pPr>
+      <w:r>
+        <w:t>A. Bỏ qua hoàn toàn việc vệ sinh và chế độ ăn nếu dùng chlorhexidine</w:t>
+      </w:r>
+    </w:p>
+    <w:p>
+      <w:pPr>
+        <w:pStyle w:val="Option"/>
+      </w:pPr>
+      <w:r>
+        <w:t>B. Giữ đề nghị vì một đốm trắng luôn đòi hỏi chlorhexidine dài hạn</w:t>
+      </w:r>
+    </w:p>
+    <w:p>
+      <w:pPr>
+        <w:pStyle w:val="Option"/>
+      </w:pPr>
+      <w:r>
+        <w:t>C. Chỉ dùng chlorhexidine để trám bít hố rãnh</w:t>
+      </w:r>
+    </w:p>
+    <w:p>
+      <w:pPr>
+        <w:pStyle w:val="Option"/>
+      </w:pPr>
+      <w:r>
+        <w:t>D. Hiểu chlorhexidine là biện pháp chọn lọc trong bối cảnh giáo trình; chỉ dùng khi người khám chỉ định sau đánh giá nguy cơ và hướng dẫn hiện hành</w:t>
+      </w:r>
+    </w:p>
+    <w:p>
+      <w:pPr>
+        <w:pStyle w:val="Answer"/>
+        <w:keepNext/>
+      </w:pPr>
+      <w:r>
+        <w:t>Đáp án: D</w:t>
+      </w:r>
+    </w:p>
+    <w:p>
+      <w:pPr>
+        <w:pStyle w:val="Answer"/>
+      </w:pPr>
+      <w:r>
+        <w:t>Giải thích: SGK nêu dùng trong trường hợp nặng khi fluor chưa đủ, và có đợt ngắn trong phác đồ; không chuyển thành chỉ định phổ quát tự điều trị.</w:t>
+      </w:r>
+    </w:p>
+    <w:p>
+      <w:pPr>
+        <w:pStyle w:val="Question"/>
+      </w:pPr>
+      <w:r>
+        <w:t>Câu 119. SGK ghi trẻ dưới 2 tuổi không nên dùng kem fluor, còn tài liệu nhóm cho phép lượng rất nhỏ. Khi làm bài và tư vấn ngoài thực tế, cách xử lý mâu thuẫn nào đúng nhất?</w:t>
+      </w:r>
+    </w:p>
+    <w:p>
+      <w:pPr>
+        <w:pStyle w:val="Option"/>
+      </w:pPr>
+      <w:r>
+        <w:t>A. Bỏ qua nguy cơ nuốt vì fluor không thể có tác dụng bất lợi</w:t>
+      </w:r>
+    </w:p>
+    <w:p>
+      <w:pPr>
+        <w:pStyle w:val="Option"/>
+      </w:pPr>
+      <w:r>
+        <w:t>B. Nêu rõ hai tài liệu không thống nhất; với trẻ cụ thể phải kiểm tra khuyến cáo cập nhật, lượng kem và nguy cơ nuốt</w:t>
+      </w:r>
+    </w:p>
+    <w:p>
+      <w:pPr>
+        <w:pStyle w:val="Option"/>
+      </w:pPr>
+      <w:r>
+        <w:t>C. Tự chọn nồng độ và lượng kem chỉ từ tuổi mà không xét nguồn fluor khác</w:t>
+      </w:r>
+    </w:p>
+    <w:p>
+      <w:pPr>
+        <w:pStyle w:val="Option"/>
+      </w:pPr>
+      <w:r>
+        <w:t>D. Lấy đồng thời cả hai câu thành chỉ định tuyệt đối cho mọi trẻ</w:t>
+      </w:r>
+    </w:p>
+    <w:p>
+      <w:pPr>
+        <w:pStyle w:val="Answer"/>
+        <w:keepNext/>
+      </w:pPr>
+      <w:r>
+        <w:t>Đáp án: B</w:t>
+      </w:r>
+    </w:p>
+    <w:p>
+      <w:pPr>
+        <w:pStyle w:val="Answer"/>
+      </w:pPr>
+      <w:r>
+        <w:t>Giải thích: Hai nguồn trong thư mục khác nhau ở chỉ dẫn trẻ nhỏ; học liệu không đủ để ấn định một phác đồ hiện hành cho mọi trẻ.</w:t>
+      </w:r>
+    </w:p>
+    <w:p>
+      <w:pPr>
+        <w:pStyle w:val="Question"/>
+      </w:pPr>
+      <w:r>
+        <w:t>Câu 120. Một sinh viên lấy câu SGK “kem fluor dùng từ khi răng mọc có hiệu quả hơn bổ sung fluor từ lúc mới sinh” để tự kê viên fluor cho trẻ sơ sinh. Sai sót chính ở đâu?</w:t>
+      </w:r>
+    </w:p>
+    <w:p>
+      <w:pPr>
+        <w:pStyle w:val="Option"/>
+      </w:pPr>
+      <w:r>
+        <w:t>A. Không trích đúng tên thương mại của viên</w:t>
+      </w:r>
+    </w:p>
+    <w:p>
+      <w:pPr>
+        <w:pStyle w:val="Option"/>
+      </w:pPr>
+      <w:r>
+        <w:t>B. Không yêu cầu xét nghiệm S. mutans trước mọi lần chải răng</w:t>
+      </w:r>
+    </w:p>
+    <w:p>
+      <w:pPr>
+        <w:pStyle w:val="Option"/>
+      </w:pPr>
+      <w:r>
+        <w:t>C. Biến nhận xét so sánh trong giáo trình thành chỉ định cá thể hóa mà chưa đánh giá nguồn fluor, tuổi và khuyến cáo cập nhật</w:t>
+      </w:r>
+    </w:p>
+    <w:p>
+      <w:pPr>
+        <w:pStyle w:val="Option"/>
+      </w:pPr>
+      <w:r>
+        <w:t>D. Không áp dụng sealant cho răng chưa mọc</w:t>
+      </w:r>
+    </w:p>
+    <w:p>
+      <w:pPr>
+        <w:pStyle w:val="Answer"/>
+        <w:keepNext/>
+      </w:pPr>
+      <w:r>
+        <w:t>Đáp án: C</w:t>
+      </w:r>
+    </w:p>
+    <w:p>
+      <w:pPr>
+        <w:pStyle w:val="Answer"/>
+      </w:pPr>
+      <w:r>
+        <w:t>Giải thích: SGK nhấn mạnh hiệu quả của fluor tại chỗ đều đặn sau mọc răng; điều đó không cấp phép tự kê fluor toàn thân cho trẻ cụ thể.</w:t>
       </w:r>
     </w:p>
     <w:sectPr>

</xml_diff>

<commit_message>
Rewrite dental quizzes as mock exam questions
</commit_message>
<xml_diff>
--- a/TN Sâu Răng Học AI/Bài 1. Quan niệm mới trong chẩn đoán và điều trị bệnh sâu răng.docx
+++ b/TN Sâu Răng Học AI/Bài 1. Quan niệm mới trong chẩn đoán và điều trị bệnh sâu răng.docx
@@ -12,7 +12,7 @@
     </w:p>
     <w:p>
       <w:r>
-        <w:t>Bộ câu hỏi ôn tập · 120 câu · Từ nhận biết đến vận dụng lâm sàng</w:t>
+        <w:t>Đề trắc nghiệm mô phỏng · 120 câu · Từ nhận biết đến vận dụng lâm sàng</w:t>
       </w:r>
     </w:p>
     <w:p>
@@ -33,7 +33,7 @@
         <w:pStyle w:val="Question"/>
       </w:pPr>
       <w:r>
-        <w:t>Câu 1. Sâu răng trong SGK Bài 1 được hiểu phù hợp nhất là gì?</w:t>
+        <w:t>Câu 1. Định nghĩa nào mô tả đúng nhất bệnh sâu răng?</w:t>
       </w:r>
     </w:p>
     <w:p>
@@ -90,7 +90,7 @@
         <w:pStyle w:val="Question"/>
       </w:pPr>
       <w:r>
-        <w:t>Câu 2. Theo SGK, nhận định nào đúng về vi khuẩn trên bề mặt răng?</w:t>
+        <w:t>Câu 2. Một răng có mảng bám vi khuẩn nhưng chưa xuất hiện tổn thương. Nhận định nào giải thích đúng nhất?</w:t>
       </w:r>
     </w:p>
     <w:p>
@@ -139,7 +139,7 @@
         <w:pStyle w:val="Answer"/>
       </w:pPr>
       <w:r>
-        <w:t>Giải thích: Giáo trình nêu sự tích tụ vi khuẩn tại chỗ là điều kiện cần, nhưng sâu răng còn phụ thuộc cơ chất, răng, thời gian và yếu tố bảo vệ.</w:t>
+        <w:t>Giải thích: Mảng bám vi khuẩn là một điều kiện quan trọng, nhưng sâu răng còn phụ thuộc đường dễ lên men, thời gian, bề mặt răng, nước bọt và yếu tố bảo vệ.</w:t>
       </w:r>
     </w:p>
     <w:p>
@@ -147,7 +147,7 @@
         <w:pStyle w:val="Question"/>
       </w:pPr>
       <w:r>
-        <w:t>Câu 3. Vi khuẩn được giáo trình gắn với khởi phát sang thương sâu răng là gì?</w:t>
+        <w:t>Câu 3. Loài vi khuẩn nào thường liên quan đến mảng bám gây sâu răng ở giai đoạn đầu?</w:t>
       </w:r>
     </w:p>
     <w:p>
@@ -196,7 +196,7 @@
         <w:pStyle w:val="Answer"/>
       </w:pPr>
       <w:r>
-        <w:t>Giải thích: SGK mô tả S. mutans có vai trò quan trọng ở giai đoạn khởi phát.</w:t>
+        <w:t>Giải thích: S. mutans thường liên quan đến mảng bám sinh acid; sâu răng là bệnh của cả hệ vi sinh mảng bám, không do một loài duy nhất quyết định.</w:t>
       </w:r>
     </w:p>
     <w:p>
@@ -204,7 +204,7 @@
         <w:pStyle w:val="Question"/>
       </w:pPr>
       <w:r>
-        <w:t>Câu 4. Vi khuẩn nào được giáo trình gắn với sang thương tiến sâu vào ngà?</w:t>
+        <w:t>Câu 4. Loài vi khuẩn nào thường được tìm thấy khi tổn thương sâu đã tiến vào ngà?</w:t>
       </w:r>
     </w:p>
     <w:p>
@@ -253,7 +253,7 @@
         <w:pStyle w:val="Answer"/>
       </w:pPr>
       <w:r>
-        <w:t>Giải thích: Lactobacillus được nêu thường gặp khi tổn thương đã tiến sâu vào ngà.</w:t>
+        <w:t>Giải thích: Lactobacillus thường liên quan đến môi trường acid và tổn thương đã tiến triển; riêng sự hiện diện của nó không đủ chẩn đoán độ sâu.</w:t>
       </w:r>
     </w:p>
     <w:p>
@@ -318,7 +318,7 @@
         <w:pStyle w:val="Question"/>
       </w:pPr>
       <w:r>
-        <w:t>Câu 6. Trong các loại carbohydrate, chất được SGK nêu là cơ chất ưa thích của vi khuẩn gây sâu răng là gì?</w:t>
+        <w:t>Câu 6. Carbohydrate nào vừa cung cấp cơ chất tạo acid, vừa giúp vi khuẩn tạo polysaccharide bám dính?</w:t>
       </w:r>
     </w:p>
     <w:p>
@@ -375,7 +375,7 @@
         <w:pStyle w:val="Question"/>
       </w:pPr>
       <w:r>
-        <w:t>Câu 7. Theo SGK, pH mảng bám có thể duy trì tính acid khoảng bao lâu sau khi ăn carbohydrate?</w:t>
+        <w:t>Câu 7. Sau một lần ăn thực phẩm chứa đường, pH mảng bám thường giảm trong khoảng thời gian cỡ nào trước khi hồi phục?</w:t>
       </w:r>
     </w:p>
     <w:p>
@@ -424,7 +424,7 @@
         <w:pStyle w:val="Answer"/>
       </w:pPr>
       <w:r>
-        <w:t>Giải thích: Con số khoảng 30 phút giúp giải thích tác hại của việc ăn vặt lặp lại; không phải thời gian cố định ở mọi người.</w:t>
+        <w:t>Giải thích: Khoảng 30 phút là mốc minh họa cho đợt pH giảm sau ăn đường; thời gian thực tế thay đổi theo nước bọt, mảng bám và lượng đường.</w:t>
       </w:r>
     </w:p>
     <w:p>
@@ -546,7 +546,7 @@
         <w:pStyle w:val="Question"/>
       </w:pPr>
       <w:r>
-        <w:t>Câu 10. Tác dụng đệm acid của nước bọt được SGK gắn chủ yếu với thành phần nào?</w:t>
+        <w:t>Câu 10. Thành phần nào của nước bọt góp phần quan trọng vào khả năng đệm acid?</w:t>
       </w:r>
     </w:p>
     <w:p>
@@ -603,7 +603,7 @@
         <w:pStyle w:val="Question"/>
       </w:pPr>
       <w:r>
-        <w:t>Câu 11. Bộ ion nào trong nước bọt được nêu hỗ trợ tái khoáng bề mặt răng?</w:t>
+        <w:t>Câu 11. Nhóm ion nào trong nước bọt trực tiếp hỗ trợ tái khoáng bề mặt răng?</w:t>
       </w:r>
     </w:p>
     <w:p>
@@ -652,7 +652,7 @@
         <w:pStyle w:val="Answer"/>
       </w:pPr>
       <w:r>
-        <w:t>Giải thích: SGK nêu calcium, phosphate và fluoride là các thành phần khoáng hỗ trợ tái khoáng.</w:t>
+        <w:t>Giải thích: Calcium và phosphate cung cấp ion cho tái khoáng; fluoride hỗ trợ quá trình này và tăng sức đề kháng của men với acid.</w:t>
       </w:r>
     </w:p>
     <w:p>
@@ -717,7 +717,7 @@
         <w:pStyle w:val="Question"/>
       </w:pPr>
       <w:r>
-        <w:t>Câu 13. Theo mô tả của SGK, hydroxyapatite men bắt đầu hòa tan khi pH xuống khoảng mức nào?</w:t>
+        <w:t>Câu 13. Ở điều kiện nước bọt điển hình, hydroxyapatite của men dễ mất khoáng khi pH xuống khoảng mức nào?</w:t>
       </w:r>
     </w:p>
     <w:p>
@@ -766,7 +766,7 @@
         <w:pStyle w:val="Answer"/>
       </w:pPr>
       <w:r>
-        <w:t>Giải thích: Giáo trình dùng ngưỡng khoảng pH &lt; 5,5 để giải thích mất khoáng hydroxyapatite ở men; đây không là tiêu chí đơn độc để chẩn đoán.</w:t>
+        <w:t>Giải thích: Khoảng pH 5,5 thường dùng để minh họa ngưỡng hòa tan của hydroxyapatite men. Ngưỡng thực tế phụ thuộc nồng độ calcium và phosphate trong môi trường miệng.</w:t>
       </w:r>
     </w:p>
     <w:p>
@@ -774,7 +774,7 @@
         <w:pStyle w:val="Question"/>
       </w:pPr>
       <w:r>
-        <w:t>Câu 14. Một sang thương sâu men mới chớm, chưa tạo lỗ, thường được SGK định hướng xử trí thế nào?</w:t>
+        <w:t>Câu 14. Một đốm trắng sâu men còn nguyên bề mặt, chưa tạo lỗ. Hướng xử trí ban đầu nào phù hợp nhất?</w:t>
       </w:r>
     </w:p>
     <w:p>
@@ -888,7 +888,7 @@
         <w:pStyle w:val="Question"/>
       </w:pPr>
       <w:r>
-        <w:t>Câu 16. Dấu hiệu nào được SGK mô tả như biểu hiện lâm sàng của phản ứng ngà đổi màu?</w:t>
+        <w:t>Câu 16. Khi quan sát vùng ngà dưới một tổn thương sâu đã tiến triển chậm, màu nào có thể gặp?</w:t>
       </w:r>
     </w:p>
     <w:p>
@@ -994,7 +994,7 @@
         <w:pStyle w:val="Answer"/>
       </w:pPr>
       <w:r>
-        <w:t>Giải thích: Ngà nhiễm trùng là lớp bên ngoài, mất khả năng tái khoáng và được giáo trình chỉ định loại bỏ.</w:t>
+        <w:t>Giải thích: Ngà nhiễm trùng ngoài cùng thường mềm, nhiều vi khuẩn và khó tái khoáng. Khi tổn thương sâu sát tủy, mức lấy mô phải được chọn lọc để tránh lộ tủy và vẫn bảo đảm bờ phục hồi kín.</w:t>
       </w:r>
     </w:p>
     <w:p>
@@ -1059,7 +1059,7 @@
         <w:pStyle w:val="Question"/>
       </w:pPr>
       <w:r>
-        <w:t>Câu 19. Chẩn đoán sâu răng hiện đại theo SGK vượt ra ngoài việc gì?</w:t>
+        <w:t>Câu 19. Trong đánh giá sâu răng, cách tiếp cận nào là quá hạn hẹp?</w:t>
       </w:r>
     </w:p>
     <w:p>
@@ -1108,7 +1108,7 @@
         <w:pStyle w:val="Answer"/>
       </w:pPr>
       <w:r>
-        <w:t>Giải thích: SGK nhấn mạnh không đồng nhất chẩn đoán với chỉ tìm lỗ sâu; cần đánh giá nguy cơ, mức độ và hoạt tính.</w:t>
+        <w:t>Giải thích: Chỉ tìm lỗ sâu sẽ bỏ sót sang thương sớm; còn cần xác định mức độ, hoạt tính và nguy cơ của người bệnh.</w:t>
       </w:r>
     </w:p>
     <w:p>
@@ -1116,7 +1116,7 @@
         <w:pStyle w:val="Question"/>
       </w:pPr>
       <w:r>
-        <w:t>Câu 20. Ba nhóm chẩn đoán chung được SGK nêu là gì?</w:t>
+        <w:t>Câu 20. Khi mô tả mức độ chắc chắn và biểu hiện của một sang thương, ba nhóm nào dưới đây hợp lý nhất?</w:t>
       </w:r>
     </w:p>
     <w:p>
@@ -1165,7 +1165,7 @@
         <w:pStyle w:val="Answer"/>
       </w:pPr>
       <w:r>
-        <w:t>Giải thích: Đây là ba mức chung theo giáo trình ở phần chẩn đoán.</w:t>
+        <w:t>Giải thích: Có thể mô tả lần lượt vùng mới nghi ngờ, sang thương khởi phát còn nguyên bề mặt và sang thương đã tạo lỗ. Sau đó vẫn cần đánh giá độ sâu và hoạt tính.</w:t>
       </w:r>
     </w:p>
     <w:p>
@@ -1173,7 +1173,7 @@
         <w:pStyle w:val="Question"/>
       </w:pPr>
       <w:r>
-        <w:t>Câu 21. Nếu thông tin bệnh sử và khám chưa đủ để xác định sâu răng, SGK khuyên hướng tiếp cận nào?</w:t>
+        <w:t>Câu 21. Bệnh sử và khám trực tiếp chưa đủ để xác định một vùng nghi sâu kẽ. Bước tiếp theo phù hợp là gì?</w:t>
       </w:r>
     </w:p>
     <w:p>
@@ -1222,7 +1222,7 @@
         <w:pStyle w:val="Answer"/>
       </w:pPr>
       <w:r>
-        <w:t>Giải thích: Giáo trình nhấn mạnh lựa chọn phương pháp bổ sung khi thông tin ban đầu chưa đủ.</w:t>
+        <w:t>Giải thích: Khi thông tin ban đầu chưa đủ, cần chọn thăm khám hoặc phương tiện hỗ trợ phù hợp thay vì khẳng định hoặc can thiệp vội.</w:t>
       </w:r>
     </w:p>
     <w:p>
@@ -1287,7 +1287,7 @@
         <w:pStyle w:val="Question"/>
       </w:pPr>
       <w:r>
-        <w:t>Câu 23. Quan điểm điều trị nào phù hợp nhất với SGK?</w:t>
+        <w:t>Câu 23. Kế hoạch điều trị sâu răng nào xử lý cả tổn thương hiện có và quá trình gây bệnh?</w:t>
       </w:r>
     </w:p>
     <w:p>
@@ -1344,7 +1344,7 @@
         <w:pStyle w:val="Question"/>
       </w:pPr>
       <w:r>
-        <w:t>Câu 24. Trong ví dụ phân loại vật liệu của SGK, vật liệu che tủy được nêu là gì?</w:t>
+        <w:t>Câu 24. Ở răng sâu gần tủy còn khả năng duy trì tủy sống, khi có chỉ định che tủy, vật liệu nào dưới đây có thể được chọn?</w:t>
       </w:r>
     </w:p>
     <w:p>
@@ -1393,7 +1393,7 @@
         <w:pStyle w:val="Answer"/>
       </w:pPr>
       <w:r>
-        <w:t>Giải thích: Calcium hydroxide là ví dụ vật liệu che tủy trong giáo trình.</w:t>
+        <w:t>Giải thích: Calcium hydroxide là một ví dụ vật liệu dùng trong che tủy khi điều kiện lâm sàng phù hợp; lựa chọn thực tế phụ thuộc tình trạng tủy và chỉ định.</w:t>
       </w:r>
     </w:p>
     <w:p>
@@ -1401,7 +1401,7 @@
         <w:pStyle w:val="Question"/>
       </w:pPr>
       <w:r>
-        <w:t>Câu 25. Trong ví dụ phân loại vật liệu của SGK, vật liệu nào thuộc nhóm trám lót/làm nền?</w:t>
+        <w:t>Câu 25. Sau khi xử trí một xoang sâu, bác sĩ cần lớp lót hoặc nền dưới phục hồi. Vật liệu nào dưới đây phù hợp?</w:t>
       </w:r>
     </w:p>
     <w:p>
@@ -1450,7 +1450,7 @@
         <w:pStyle w:val="Answer"/>
       </w:pPr>
       <w:r>
-        <w:t>Giải thích: SGK nêu glass ionomer và polycarboxylate cement là các ví dụ vật liệu lót/nền.</w:t>
+        <w:t>Giải thích: Glass ionomer cement có thể được dùng làm lớp lót hoặc nền trong một số phục hồi; vật liệu được chọn theo độ sâu xoang và mục tiêu điều trị.</w:t>
       </w:r>
     </w:p>
     <w:p>
@@ -1458,7 +1458,7 @@
         <w:pStyle w:val="Question"/>
       </w:pPr>
       <w:r>
-        <w:t>Câu 26. Trong ví dụ phân loại vật liệu của SGK, nhóm nào có thể là vật liệu trám kết thúc?</w:t>
+        <w:t>Câu 26. Một xoang sâu ngà đã được xử trí và cần phục hồi trực tiếp thân răng. Cặp vật liệu nào phù hợp?</w:t>
       </w:r>
     </w:p>
     <w:p>
@@ -1515,7 +1515,7 @@
         <w:pStyle w:val="Question"/>
       </w:pPr>
       <w:r>
-        <w:t>Câu 27. Ba nguyên tắc phòng ngừa sâu răng trong SGK là gì?</w:t>
+        <w:t>Câu 27. Kế hoạch dự phòng nào tác động đồng thời lên mảng bám, đường ăn và khả năng bảo vệ của răng?</w:t>
       </w:r>
     </w:p>
     <w:p>
@@ -1621,7 +1621,7 @@
         <w:pStyle w:val="Answer"/>
       </w:pPr>
       <w:r>
-        <w:t>Giải thích: SGK nhắc chải răng chủ yếu làm sạch ba trong năm mặt của răng, hai mặt bên cần biện pháp vùng kẽ.</w:t>
+        <w:t>Giải thích: Bàn chải thông thường khó tiếp cận hai mặt bên tiếp giáp; cần biện pháp làm sạch kẽ phù hợp.</w:t>
       </w:r>
     </w:p>
     <w:p>
@@ -1637,7 +1637,7 @@
         <w:pStyle w:val="Question"/>
       </w:pPr>
       <w:r>
-        <w:t>Câu 29. Vì sao men răng mới mọc được giáo trình xem là nhạy cảm với acid hơn?</w:t>
+        <w:t>Câu 29. Vì sao men của răng vĩnh viễn vừa mọc thường nhạy với acid hơn men đã trưởng thành sau mọc?</w:t>
       </w:r>
     </w:p>
     <w:p>
@@ -1694,7 +1694,7 @@
         <w:pStyle w:val="Question"/>
       </w:pPr>
       <w:r>
-        <w:t>Câu 30. Theo mô tả của SGK, fluorapatite bắt đầu hòa tan ở khoảng pH nào?</w:t>
+        <w:t>Câu 30. Fluorapatite bền acid hơn hydroxyapatite. Ngưỡng hòa tan gần đúng của nó là khoảng pH nào?</w:t>
       </w:r>
     </w:p>
     <w:p>
@@ -1743,7 +1743,7 @@
         <w:pStyle w:val="Answer"/>
       </w:pPr>
       <w:r>
-        <w:t>Giải thích: SGK mô tả fluorapatite bền acid hơn hydroxyapatite, với ngưỡng hòa tan thấp hơn khoảng pH &lt; 4,5.</w:t>
+        <w:t>Giải thích: Fluorapatite thường được minh họa là bền acid hơn hydroxyapatite, với ngưỡng hòa tan khoảng pH 4,5. Đây chỉ là mốc xấp xỉ, thay đổi theo môi trường ion.</w:t>
       </w:r>
     </w:p>
     <w:p>
@@ -1751,7 +1751,7 @@
         <w:pStyle w:val="Question"/>
       </w:pPr>
       <w:r>
-        <w:t>Câu 31. Hướng hình nón điển hình của sang thương sâu men là gì?</w:t>
+        <w:t>Câu 31. Ở tổn thương sâu men khởi đầu từ hố rãnh mặt nhai, hình nón tổn thương thường hướng thế nào?</w:t>
       </w:r>
     </w:p>
     <w:p>
@@ -1800,7 +1800,7 @@
         <w:pStyle w:val="Answer"/>
       </w:pPr>
       <w:r>
-        <w:t>Giải thích: Sâu men lan theo hướng trụ men, tạo nón có đỉnh hướng bề mặt và đáy ở đường nối men-ngà.</w:t>
+        <w:t>Giải thích: Với kiểu sâu hố rãnh được hỏi, phần tổn thương trong men thường hẹp ở bề mặt và rộng gần đường nối men–ngà; không áp hình này cho mọi vị trí sâu men.</w:t>
       </w:r>
     </w:p>
     <w:p>
@@ -1808,7 +1808,7 @@
         <w:pStyle w:val="Question"/>
       </w:pPr>
       <w:r>
-        <w:t>Câu 32. Đặc điểm nào gợi ý sang thương trắng đục đã bất hoạt trong ví dụ Hình 1.2 của SGK?</w:t>
+        <w:t>Câu 32. Đốm trắng đục ở mặt răng có đặc điểm nào gợi ý đã ngừng hoạt động?</w:t>
       </w:r>
     </w:p>
     <w:p>
@@ -1857,7 +1857,7 @@
         <w:pStyle w:val="Answer"/>
       </w:pPr>
       <w:r>
-        <w:t>Giải thích: SGK mô tả đốm trắng đục nhưng bề mặt trơn bóng và vệ sinh đã cải thiện là sang thương bất hoạt.</w:t>
+        <w:t>Giải thích: Bề mặt đốm trắng trơn bóng, ít giữ mảng bám và ổn định qua theo dõi gợi tổn thương đã ngừng hoạt động.</w:t>
       </w:r>
     </w:p>
     <w:p>
@@ -1865,7 +1865,7 @@
         <w:pStyle w:val="Question"/>
       </w:pPr>
       <w:r>
-        <w:t>Câu 33. Điều kiện sinh học nào cần cho tái khoáng ngà bị ảnh hưởng theo SGK?</w:t>
+        <w:t>Câu 33. Yếu tố sinh học nào giúp vùng ngà bị ảnh hưởng còn khả năng tái khoáng?</w:t>
       </w:r>
     </w:p>
     <w:p>
@@ -1914,7 +1914,7 @@
         <w:pStyle w:val="Answer"/>
       </w:pPr>
       <w:r>
-        <w:t>Giải thích: SGK nêu khung collagen, tế bào tạo ngà và nguồn khoáng bên ngoài là các điều kiện hỗ trợ.</w:t>
+        <w:t>Giải thích: Khung collagen còn nguyên, tế bào tạo ngà hoạt động và nguồn ion khoáng thuận lợi tạo điều kiện cho ngà bị ảnh hưởng tái khoáng.</w:t>
       </w:r>
     </w:p>
     <w:p>
@@ -1979,7 +1979,7 @@
         <w:pStyle w:val="Question"/>
       </w:pPr>
       <w:r>
-        <w:t>Câu 35. Khi tạo xoang trong mô hình hai lớp ngà của SGK, nguyên tắc nào đúng?</w:t>
+        <w:t>Câu 35. Khi xử trí lỗ sâu ngà sâu ở răng còn tủy sống, nguyên tắc lấy mô sâu nào phù hợp nhất?</w:t>
       </w:r>
     </w:p>
     <w:p>
@@ -2003,7 +2003,7 @@
         <w:pStyle w:val="Option"/>
       </w:pPr>
       <w:r>
-        <w:t>C. Lấy lớp ngà nhiễm trùng hoại tử, bảo tồn ngà bị ảnh hưởng</w:t>
+        <w:t>C. Lấy mô sâu chọn lọc, tạo bờ phục hồi kín và bảo tồn ngà gần tủy khi phù hợp</w:t>
       </w:r>
     </w:p>
     <w:p>
@@ -2028,7 +2028,7 @@
         <w:pStyle w:val="Answer"/>
       </w:pPr>
       <w:r>
-        <w:t>Giải thích: Mục tiêu trong bài học là loại mô không còn khả năng phục hồi và giữ mô sống để bảo vệ tủy.</w:t>
+        <w:t>Giải thích: Cần tạo bờ phục hồi trên mô đủ chắc để trám kín; ở vùng rất gần tủy, có thể lấy mô sâu chọn lọc và giữ lại ngà có tiềm năng hồi phục để bảo vệ tủy.</w:t>
       </w:r>
     </w:p>
     <w:p>
@@ -2093,7 +2093,7 @@
         <w:pStyle w:val="Question"/>
       </w:pPr>
       <w:r>
-        <w:t>Câu 37. Trong các dấu hiệu sau, yếu tố nào được SGK liệt kê thuộc nhóm nguy cơ sâu răng cao?</w:t>
+        <w:t>Câu 37. Khi khám nguy cơ sâu răng cho người trưởng thành, dấu hiệu nào dưới đây cần chú ý nhất?</w:t>
       </w:r>
     </w:p>
     <w:p>
@@ -2150,7 +2150,7 @@
         <w:pStyle w:val="Question"/>
       </w:pPr>
       <w:r>
-        <w:t>Câu 38. Tình huống nào ở người trẻ được SGK nêu là dấu hiệu nguy cơ cao?</w:t>
+        <w:t>Câu 38. Ở người trẻ, tình huống nào trong 12 tháng gần đây gợi nguy cơ sâu răng cao?</w:t>
       </w:r>
     </w:p>
     <w:p>
@@ -2174,7 +2174,7 @@
         <w:pStyle w:val="Option"/>
       </w:pPr>
       <w:r>
-        <w:t>C. Có hai hoặc nhiều tổn thương sâu răng xuất hiện trước khi khám</w:t>
+        <w:t>C. Có ít nhất hai tổn thương sâu răng mới trong 12 tháng</w:t>
       </w:r>
     </w:p>
     <w:p>
@@ -2199,7 +2199,7 @@
         <w:pStyle w:val="Answer"/>
       </w:pPr>
       <w:r>
-        <w:t>Giải thích: SGK liệt kê từ hai tổn thương mới trở lên ở người trẻ như một dấu hiệu nguy cơ.</w:t>
+        <w:t>Giải thích: Nhiều tổn thương mới ở người trẻ gợi quá trình bệnh đang hoạt động và cần đánh giá nguy cơ toàn diện.</w:t>
       </w:r>
     </w:p>
     <w:p>
@@ -2256,7 +2256,7 @@
         <w:pStyle w:val="Answer"/>
       </w:pPr>
       <w:r>
-        <w:t>Giải thích: SGK sử dụng thấu quang mặt kế cận khi đánh giá tổn thương/nguy cơ; cần kết hợp dữ kiện khác.</w:t>
+        <w:t>Giải thích: Vùng thấu quang mặt kẽ gợi mất khoáng nhưng phải đối chiếu khám bề mặt, vị trí và nguy cơ trước khi kết luận.</w:t>
       </w:r>
     </w:p>
     <w:p>
@@ -2370,7 +2370,7 @@
         <w:pStyle w:val="Answer"/>
       </w:pPr>
       <w:r>
-        <w:t>Giải thích: SGK liệt kê các biến chứng lan rộng này; chúng không xảy ra ở mọi ca sâu răng.</w:t>
+        <w:t>Giải thích: Viêm mô tế bào, viêm xương và nhiễm khuẩn huyết có thể xảy ra khi nhiễm khuẩn răng lan rộng; không phải mọi lỗ sâu đều dẫn đến các biến chứng này.</w:t>
       </w:r>
     </w:p>
     <w:p>
@@ -2378,7 +2378,7 @@
         <w:pStyle w:val="Question"/>
       </w:pPr>
       <w:r>
-        <w:t>Câu 42. Vai trò của một miếng trám trong điều trị sâu răng theo SGK là gì?</w:t>
+        <w:t>Câu 42. Vai trò phù hợp của miếng trám trong kế hoạch điều trị sâu răng là gì?</w:t>
       </w:r>
     </w:p>
     <w:p>
@@ -2427,7 +2427,7 @@
         <w:pStyle w:val="Answer"/>
       </w:pPr>
       <w:r>
-        <w:t>Giải thích: Phục hồi không phải khởi đầu hoặc kết thúc của toàn bộ điều trị nếu căn nguyên vẫn còn.</w:t>
+        <w:t>Giải thích: Miếng trám phục hồi phần mô đã mất, trong khi ăn uống, mảng bám và các yếu tố nguy cơ vẫn cần được kiểm soát.</w:t>
       </w:r>
     </w:p>
     <w:p>
@@ -2435,7 +2435,7 @@
         <w:pStyle w:val="Question"/>
       </w:pPr>
       <w:r>
-        <w:t>Câu 43. Theo SGK, khi kẽ răng thưa do tụt nướu, dụng cụ nào có thể phù hợp để vệ sinh kẽ?</w:t>
+        <w:t>Câu 43. Người bệnh tụt nướu, kẽ răng rộng và dễ giữ thức ăn. Dụng cụ nào phù hợp để làm sạch vùng kẽ?</w:t>
       </w:r>
     </w:p>
     <w:p>
@@ -2492,7 +2492,7 @@
         <w:pStyle w:val="Question"/>
       </w:pPr>
       <w:r>
-        <w:t>Câu 44. Nhai kẹo cao su không đường/xylitol sau ăn khi chưa thể chải răng có lợi chủ yếu qua cơ chế nào được SGK nêu?</w:t>
+        <w:t>Câu 44. Khi chưa thể chải răng sau bữa ăn, nhai kẹo cao su không đường có thể hỗ trợ bảo vệ răng chủ yếu qua cơ chế nào?</w:t>
       </w:r>
     </w:p>
     <w:p>
@@ -2598,7 +2598,7 @@
         <w:pStyle w:val="Answer"/>
       </w:pPr>
       <w:r>
-        <w:t>Giải thích: Nhấp nhiều lần tạo các đợt acid lặp lại; tần suất tiếp xúc đường quan trọng trong cơ chế bài học.</w:t>
+        <w:t>Giải thích: Nhấp đồ ngọt nhiều lần tạo các đợt acid lặp lại; số lần và thời gian tiếp xúc đường đều quan trọng.</w:t>
       </w:r>
     </w:p>
     <w:p>
@@ -2655,7 +2655,7 @@
         <w:pStyle w:val="Answer"/>
       </w:pPr>
       <w:r>
-        <w:t>Giải thích: SGK nêu men mới mọc giàu carbonate và hố rãnh sâu thuận lợi tích tụ mảng bám.</w:t>
+        <w:t>Giải thích: Hố rãnh sâu giữ mảng bám, còn men vừa mọc chưa hoàn tất trưởng thành sau mọc nên dễ chịu tác động của acid hơn.</w:t>
       </w:r>
     </w:p>
     <w:p>
@@ -2777,7 +2777,7 @@
         <w:pStyle w:val="Question"/>
       </w:pPr>
       <w:r>
-        <w:t>Câu 49. Trẻ có răng hàm vĩnh viễn mới mọc, hố rãnh mặt nhai sâu nhưng chưa có dấu hủy khoáng. Biện pháp phòng ngừa tại chỗ nào phù hợp nhất với SGK?</w:t>
+        <w:t>Câu 49. Răng hàm vĩnh viễn mới mọc có hố rãnh sâu, chưa thấy tổn thương mất khoáng. Biện pháp dự phòng tại chỗ nào nên được xem xét?</w:t>
       </w:r>
     </w:p>
     <w:p>
@@ -2834,7 +2834,7 @@
         <w:pStyle w:val="Question"/>
       </w:pPr>
       <w:r>
-        <w:t>Câu 50. Một mặt kẽ nghi sâu nhưng không nhìn rõ khi khám trực tiếp. Phương pháp hình ảnh nào tài liệu nhóm ưu tiên để phát hiện sâu kẽ?</w:t>
+        <w:t>Câu 50. Một mặt kẽ nghi sâu nhưng không quan sát rõ khi khám trực tiếp. Loại phim nào thường hữu ích nhất để đánh giá vùng này?</w:t>
       </w:r>
     </w:p>
     <w:p>
@@ -2883,7 +2883,7 @@
         <w:pStyle w:val="Answer"/>
       </w:pPr>
       <w:r>
-        <w:t>Giải thích: Tài liệu nhóm nêu phim cánh cắn hữu ích cho sâu kẽ khó quan sát; chỉ định cụ thể do bác sĩ quyết định.</w:t>
+        <w:t>Giải thích: Phim cánh cắn thường hữu ích cho sâu kẽ khó quan sát; chỉ định chụp tùy kết quả khám và nguy cơ cụ thể.</w:t>
       </w:r>
     </w:p>
     <w:p>
@@ -2997,7 +2997,7 @@
         <w:pStyle w:val="Answer"/>
       </w:pPr>
       <w:r>
-        <w:t>Giải thích: Tài liệu nhóm hướng dẫn quan sát sau làm sạch và dùng thổi khô để thấy thay đổi độ đục.</w:t>
+        <w:t>Giải thích: Làm sạch trước khi quan sát và thổi khô khi cần giúp phân biệt vết bám màu với vùng men mất khoáng sớm.</w:t>
       </w:r>
     </w:p>
     <w:p>
@@ -3005,7 +3005,7 @@
         <w:pStyle w:val="Question"/>
       </w:pPr>
       <w:r>
-        <w:t>Câu 53. Khi dùng thám trâm ở vùng nghi sâu, cách làm nào tài liệu nhóm nhấn mạnh?</w:t>
+        <w:t>Câu 53. Khi thăm khám bằng thám trâm tại vùng nghi sâu men, thao tác nào phù hợp?</w:t>
       </w:r>
     </w:p>
     <w:p>
@@ -3054,7 +3054,7 @@
         <w:pStyle w:val="Answer"/>
       </w:pPr>
       <w:r>
-        <w:t>Giải thích: Thao tác mạnh có thể gây tổn thương iatrogenic; tài liệu nhóm khuyên thăm khám nhẹ nhàng.</w:t>
+        <w:t>Giải thích: Dùng lực mạnh có thể làm hỏng bề mặt sang thương men chưa tạo lỗ; quan sát trên bề mặt sạch và thăm nhẹ nếu cần.</w:t>
       </w:r>
     </w:p>
     <w:p>
@@ -3168,7 +3168,7 @@
         <w:pStyle w:val="Answer"/>
       </w:pPr>
       <w:r>
-        <w:t>Giải thích: Sự sắp xếp chen chúc cản vệ sinh và tăng tích tụ mảng bám theo giáo trình.</w:t>
+        <w:t>Giải thích: Răng chen chúc tạo vùng giữ mảng bám và gây khó khăn khi làm sạch các mặt kẽ.</w:t>
       </w:r>
     </w:p>
     <w:p>
@@ -3176,7 +3176,7 @@
         <w:pStyle w:val="Question"/>
       </w:pPr>
       <w:r>
-        <w:t>Câu 56. Một người hỏi liệu giảm đường nhưng bỏ chải răng có phòng sâu răng đủ hay không. Trả lời nào sát ba trụ của SGK?</w:t>
+        <w:t>Câu 56. Người bệnh đã giảm đồ ngọt nhưng không chải răng đều. Lời khuyên nào đầy đủ nhất để giảm nguy cơ sâu răng?</w:t>
       </w:r>
     </w:p>
     <w:p>
@@ -3233,39 +3233,39 @@
         <w:pStyle w:val="Question"/>
       </w:pPr>
       <w:r>
-        <w:t>Câu 57. Theo số liệu lịch sử được SGK trích từ điều tra năm 2001, tỷ lệ sâu răng sữa ở trẻ 6-8 tuổi là bao nhiêu?</w:t>
-      </w:r>
-    </w:p>
-    <w:p>
-      <w:pPr>
-        <w:pStyle w:val="Option"/>
-      </w:pPr>
-      <w:r>
-        <w:t>A. 100%</w:t>
-      </w:r>
-    </w:p>
-    <w:p>
-      <w:pPr>
-        <w:pStyle w:val="Option"/>
-      </w:pPr>
-      <w:r>
-        <w:t>B. 84,9%</w:t>
-      </w:r>
-    </w:p>
-    <w:p>
-      <w:pPr>
-        <w:pStyle w:val="Option"/>
-      </w:pPr>
-      <w:r>
-        <w:t>C. 18,4%</w:t>
-      </w:r>
-    </w:p>
-    <w:p>
-      <w:pPr>
-        <w:pStyle w:val="Option"/>
-      </w:pPr>
-      <w:r>
-        <w:t>D. 8,49%</w:t>
+        <w:t>Câu 57. Một thiếu niên có ba tổn thương sâu răng mới trong 12 tháng, thường ăn vặt và bị khô miệng do thuốc. Nhận định nào phù hợp nhất?</w:t>
+      </w:r>
+    </w:p>
+    <w:p>
+      <w:pPr>
+        <w:pStyle w:val="Option"/>
+      </w:pPr>
+      <w:r>
+        <w:t>A. Nguy cơ thấp vì người bệnh còn trẻ</w:t>
+      </w:r>
+    </w:p>
+    <w:p>
+      <w:pPr>
+        <w:pStyle w:val="Option"/>
+      </w:pPr>
+      <w:r>
+        <w:t>B. Có nhiều dấu hiệu nguy cơ cao, cần đánh giá toàn diện và dự phòng tích cực</w:t>
+      </w:r>
+    </w:p>
+    <w:p>
+      <w:pPr>
+        <w:pStyle w:val="Option"/>
+      </w:pPr>
+      <w:r>
+        <w:t>C. Chỉ khô miệng mới đáng quan tâm; tổn thương mới không có giá trị</w:t>
+      </w:r>
+    </w:p>
+    <w:p>
+      <w:pPr>
+        <w:pStyle w:val="Option"/>
+      </w:pPr>
+      <w:r>
+        <w:t>D. Không cần can thiệp nếu hiện tại chưa đau răng</w:t>
       </w:r>
     </w:p>
     <w:p>
@@ -3282,7 +3282,7 @@
         <w:pStyle w:val="Answer"/>
       </w:pPr>
       <w:r>
-        <w:t>Giải thích: Đây là số liệu của nhóm tuổi và thời điểm được nêu trong giáo trình, không phải ước tính hiện tại.</w:t>
+        <w:t>Giải thích: Nhiều tổn thương mới, tiếp xúc đường thường xuyên và khô miệng cùng gợi nguy cơ sâu răng cao; cần đánh giá thêm trước khi lập kế hoạch dự phòng.</w:t>
       </w:r>
     </w:p>
     <w:p>
@@ -3290,39 +3290,39 @@
         <w:pStyle w:val="Question"/>
       </w:pPr>
       <w:r>
-        <w:t>Câu 58. Khi gặp tỷ lệ sâu răng được nêu trong giáo trình từ khảo sát năm 2001, cách diễn giải nào đúng?</w:t>
-      </w:r>
-    </w:p>
-    <w:p>
-      <w:pPr>
-        <w:pStyle w:val="Option"/>
-      </w:pPr>
-      <w:r>
-        <w:t>A. Áp dụng cho mọi độ tuổi và mọi năm</w:t>
-      </w:r>
-    </w:p>
-    <w:p>
-      <w:pPr>
-        <w:pStyle w:val="Option"/>
-      </w:pPr>
-      <w:r>
-        <w:t>B. Gắn với năm, địa điểm và nhóm tuổi của khảo sát; không suy thành tỷ lệ hiện tại ở mọi nơi</w:t>
-      </w:r>
-    </w:p>
-    <w:p>
-      <w:pPr>
-        <w:pStyle w:val="Option"/>
-      </w:pPr>
-      <w:r>
-        <w:t>C. Không cần đọc thời điểm hoặc mẫu khảo sát</w:t>
-      </w:r>
-    </w:p>
-    <w:p>
-      <w:pPr>
-        <w:pStyle w:val="Option"/>
-      </w:pPr>
-      <w:r>
-        <w:t>D. Chứng minh mọi trẻ đều bị sâu răng</w:t>
+        <w:t>Câu 58. Sau khi hướng dẫn dự phòng cho một người từng có nhiều lỗ sâu, chỉ số nào hữu ích nhất để đánh giá diễn tiến khi tái khám?</w:t>
+      </w:r>
+    </w:p>
+    <w:p>
+      <w:pPr>
+        <w:pStyle w:val="Option"/>
+      </w:pPr>
+      <w:r>
+        <w:t>A. Chỉ số răng mọc thêm trong năm, không cần xem tổn thương</w:t>
+      </w:r>
+    </w:p>
+    <w:p>
+      <w:pPr>
+        <w:pStyle w:val="Option"/>
+      </w:pPr>
+      <w:r>
+        <w:t>B. Số tổn thương mới hoặc tiến triển, hoạt tính và thay đổi yếu tố nguy cơ</w:t>
+      </w:r>
+    </w:p>
+    <w:p>
+      <w:pPr>
+        <w:pStyle w:val="Option"/>
+      </w:pPr>
+      <w:r>
+        <w:t>C. Chỉ màu kem đánh răng người bệnh mua</w:t>
+      </w:r>
+    </w:p>
+    <w:p>
+      <w:pPr>
+        <w:pStyle w:val="Option"/>
+      </w:pPr>
+      <w:r>
+        <w:t>D. Chỉ mức độ ê buốt trong ngày tái khám</w:t>
       </w:r>
     </w:p>
     <w:p>
@@ -3339,7 +3339,7 @@
         <w:pStyle w:val="Answer"/>
       </w:pPr>
       <w:r>
-        <w:t>Giải thích: Số liệu dịch tễ chỉ có ý nghĩa trong bối cảnh khảo sát cụ thể.</w:t>
+        <w:t>Giải thích: Số tổn thương mới hoặc tiến triển, hoạt tính và thay đổi yếu tố nguy cơ cho biết kế hoạch dự phòng có kiểm soát được bệnh qua thời gian hay không.</w:t>
       </w:r>
     </w:p>
     <w:p>
@@ -3404,7 +3404,7 @@
         <w:pStyle w:val="Answer"/>
       </w:pPr>
       <w:r>
-        <w:t>Giải thích: SGK có ví dụ tổn thương trắng đục bất hoạt với bề mặt trơn bóng sau cải thiện vệ sinh.</w:t>
+        <w:t>Giải thích: Bề mặt trơn bóng, ít giữ mảng bám và không lớn thêm là những dữ kiện gợi sang thương đã bất hoạt, dù màu trắng còn tồn tại.</w:t>
       </w:r>
     </w:p>
     <w:p>
@@ -3469,7 +3469,7 @@
         <w:pStyle w:val="Question"/>
       </w:pPr>
       <w:r>
-        <w:t>Câu 61. Khi thăm khám một lỗ sâu ngà, lớp ngoài mềm, không cảm giác; lớp trong còn nhạy cảm. Nên hiểu lớp trong thế nào theo SGK?</w:t>
+        <w:t>Câu 61. Ở một lỗ sâu ngà, lớp ngoài mềm và không còn cảm giác; lớp trong còn nhạy cảm. Lớp trong nhiều khả năng là gì?</w:t>
       </w:r>
     </w:p>
     <w:p>
@@ -3746,7 +3746,7 @@
         <w:pStyle w:val="Answer"/>
       </w:pPr>
       <w:r>
-        <w:t>Giải thích: Chỉnh nha được SGK liệt kê là yếu tố nguy cơ; đốm trắng cần đánh giá cùng bối cảnh mảng bám.</w:t>
+        <w:t>Giải thích: Mảng bám quanh mắc cài và đốm trắng mới làm tăng nghi ngờ sang thương hoạt động; cần đánh giá bề mặt, vệ sinh và tiếp xúc fluor.</w:t>
       </w:r>
     </w:p>
     <w:p>
@@ -3754,23 +3754,23 @@
         <w:pStyle w:val="Question"/>
       </w:pPr>
       <w:r>
-        <w:t>Câu 66. Trong quy ước của tài liệu nhóm, đốm trắng đục rõ sau thổi khô, chưa có lỗ sâu, gần nhất với nhóm nào?</w:t>
-      </w:r>
-    </w:p>
-    <w:p>
-      <w:pPr>
-        <w:pStyle w:val="Option"/>
-      </w:pPr>
-      <w:r>
-        <w:t>A. Hoại tử tủy</w:t>
-      </w:r>
-    </w:p>
-    <w:p>
-      <w:pPr>
-        <w:pStyle w:val="Option"/>
-      </w:pPr>
-      <w:r>
-        <w:t>B. S1 giai đoạn sớm</w:t>
+        <w:t>Câu 66. Sau khi làm sạch và thổi khô, vùng men xuất hiện đốm trắng đục nhưng bề mặt vẫn liên tục. Mô tả nào chính xác nhất?</w:t>
+      </w:r>
+    </w:p>
+    <w:p>
+      <w:pPr>
+        <w:pStyle w:val="Option"/>
+      </w:pPr>
+      <w:r>
+        <w:t>A. Lỗ sâu ngà lớn đã lộ tủy</w:t>
+      </w:r>
+    </w:p>
+    <w:p>
+      <w:pPr>
+        <w:pStyle w:val="Option"/>
+      </w:pPr>
+      <w:r>
+        <w:t>B. Tổn thương men sớm chưa tạo lỗ</w:t>
       </w:r>
     </w:p>
     <w:p>
@@ -3786,7 +3786,7 @@
         <w:pStyle w:val="Option"/>
       </w:pPr>
       <w:r>
-        <w:t>D. S3 lỗ sâu lớn</w:t>
+        <w:t>D. Ngà hoại tử nằm dưới phục hồi hở</w:t>
       </w:r>
     </w:p>
     <w:p>
@@ -3803,7 +3803,7 @@
         <w:pStyle w:val="Answer"/>
       </w:pPr>
       <w:r>
-        <w:t>Giải thích: S1 là ký hiệu của tài liệu nhóm cho giai đoạn sớm; SGK Bài 1 dùng ba nhóm chung và không xây dựng hệ S1-S3 ở phần này.</w:t>
+        <w:t>Giải thích: Đốm trắng chỉ rõ sau thổi khô với bề mặt còn nguyên gợi mất khoáng men giai đoạn sớm, chưa phải lỗ sâu.</w:t>
       </w:r>
     </w:p>
     <w:p>
@@ -3811,39 +3811,39 @@
         <w:pStyle w:val="Question"/>
       </w:pPr>
       <w:r>
-        <w:t>Câu 67. Trong quy ước của tài liệu nhóm, lỗ sâu có ngà đáy mềm/mủn phù hợp nhất với nhóm nào?</w:t>
-      </w:r>
-    </w:p>
-    <w:p>
-      <w:pPr>
-        <w:pStyle w:val="Option"/>
-      </w:pPr>
-      <w:r>
-        <w:t>A. S1 đốm men nguyên vẹn</w:t>
-      </w:r>
-    </w:p>
-    <w:p>
-      <w:pPr>
-        <w:pStyle w:val="Option"/>
-      </w:pPr>
-      <w:r>
-        <w:t>B. S2/S3 giai đoạn muộn</w:t>
-      </w:r>
-    </w:p>
-    <w:p>
-      <w:pPr>
-        <w:pStyle w:val="Option"/>
-      </w:pPr>
-      <w:r>
-        <w:t>C. Răng lành mạnh</w:t>
-      </w:r>
-    </w:p>
-    <w:p>
-      <w:pPr>
-        <w:pStyle w:val="Option"/>
-      </w:pPr>
-      <w:r>
-        <w:t>D. Nhiễm fluor không sâu</w:t>
+        <w:t>Câu 67. Một răng có lỗ mất chất, thấy ngà mềm ở đáy. Nhận định nào phù hợp nhất về giai đoạn tổn thương?</w:t>
+      </w:r>
+    </w:p>
+    <w:p>
+      <w:pPr>
+        <w:pStyle w:val="Option"/>
+      </w:pPr>
+      <w:r>
+        <w:t>A. Đốm men còn nguyên bề mặt</w:t>
+      </w:r>
+    </w:p>
+    <w:p>
+      <w:pPr>
+        <w:pStyle w:val="Option"/>
+      </w:pPr>
+      <w:r>
+        <w:t>B. Sang thương đã tạo lỗ và lan vào ngà</w:t>
+      </w:r>
+    </w:p>
+    <w:p>
+      <w:pPr>
+        <w:pStyle w:val="Option"/>
+      </w:pPr>
+      <w:r>
+        <w:t>C. Răng lành mạnh không mất khoáng</w:t>
+      </w:r>
+    </w:p>
+    <w:p>
+      <w:pPr>
+        <w:pStyle w:val="Option"/>
+      </w:pPr>
+      <w:r>
+        <w:t>D. Nhiễm fluor chỉ gây đổi màu men</w:t>
       </w:r>
     </w:p>
     <w:p>
@@ -3860,7 +3860,7 @@
         <w:pStyle w:val="Answer"/>
       </w:pPr>
       <w:r>
-        <w:t>Giải thích: Tài liệu nhóm dùng S2/S3 cho tổn thương có lỗ và ngà thấy được; không dùng ký hiệu này một mình để quyết định xử trí.</w:t>
+        <w:t>Giải thích: Lỗ mất chất đã lộ ngà mềm là tổn thương có tạo lỗ; cần đánh giá thêm độ sâu, hoạt tính và sức khỏe tủy trước điều trị.</w:t>
       </w:r>
     </w:p>
     <w:p>
@@ -3868,7 +3868,7 @@
         <w:pStyle w:val="Question"/>
       </w:pPr>
       <w:r>
-        <w:t>Câu 68. Một số răng mọc cùng thời điểm có vệt trắng mờ đối xứng, bề mặt trơn, không có lỗ. Chẩn đoán phân biệt nào tài liệu nhóm nêu?</w:t>
+        <w:t>Câu 68. Nhiều răng mọc cùng thời điểm có vệt trắng mờ đối xứng, bề mặt trơn và không có lỗ. Cần nghĩ đến chẩn đoán phân biệt nào?</w:t>
       </w:r>
     </w:p>
     <w:p>
@@ -3974,7 +3974,7 @@
         <w:pStyle w:val="Answer"/>
       </w:pPr>
       <w:r>
-        <w:t>Giải thích: Tài liệu nhóm dùng đáy cứng và hình chêm để phân biệt với sâu cổ răng có ngà mềm.</w:t>
+        <w:t>Giải thích: Khuyết cổ răng hình chêm, bờ sắc và đáy cứng gợi tổn thương không do sâu; ngà mềm và mảng bám sẽ tăng nghi ngờ sâu cổ răng.</w:t>
       </w:r>
     </w:p>
     <w:p>
@@ -4031,7 +4031,7 @@
         <w:pStyle w:val="Answer"/>
       </w:pPr>
       <w:r>
-        <w:t>Giải thích: Tổ hợp lỗ sâu thông tủy và thử tủy âm tính là dữ kiện tài liệu nhóm nêu trong chẩn đoán hoại tử tủy.</w:t>
+        <w:t>Giải thích: Lỗ sâu thông tủy, răng sẫm màu và thử tủy âm tính cùng gợi hoại tử tủy; cần kết hợp các thử nghiệm và khám khác để xác nhận.</w:t>
       </w:r>
     </w:p>
     <w:p>
@@ -4039,7 +4039,7 @@
         <w:pStyle w:val="Question"/>
       </w:pPr>
       <w:r>
-        <w:t>Câu 71. Người bệnh có tiền căn sâu chân răng, tụt nướu và nhiều trám hở. Theo SGK, kết luận nào hợp lý nhất?</w:t>
+        <w:t>Câu 71. Một người lớn có tiền căn sâu chân răng, tụt nướu và nhiều miếng trám hở. Kết luận nào hợp lý nhất?</w:t>
       </w:r>
     </w:p>
     <w:p>
@@ -4088,7 +4088,7 @@
         <w:pStyle w:val="Answer"/>
       </w:pPr>
       <w:r>
-        <w:t>Giải thích: SGK liệt kê cả ba yếu tố ở nhóm nguy cơ cao người lớn; vẫn phải đánh giá tổng thể.</w:t>
+        <w:t>Giải thích: Tiền căn sâu chân răng, tụt nướu và nhiều trám hở đều làm tăng nghi ngờ nguy cơ sâu răng; vẫn cần đánh giá tổng thể.</w:t>
       </w:r>
     </w:p>
     <w:p>
@@ -4153,7 +4153,7 @@
         <w:pStyle w:val="Question"/>
       </w:pPr>
       <w:r>
-        <w:t>Câu 73. Hai người dùng lượng đường tương đương; người thứ nhất dùng trong bữa chính, người thứ hai nhấp đồ ngọt rải rác. Ai có kiểu tiếp xúc đáng lo hơn theo cơ chế trong SGK?</w:t>
+        <w:t>Câu 73. Hai người dùng lượng đường tương đương. Người A dùng trong bữa chính; người B nhấp đồ ngọt rải rác cả ngày. Ai có kiểu tiếp xúc đáng lo hơn?</w:t>
       </w:r>
     </w:p>
     <w:p>
@@ -4210,7 +4210,7 @@
         <w:pStyle w:val="Question"/>
       </w:pPr>
       <w:r>
-        <w:t>Câu 74. Một ca có đốm trắng chưa lỗ nhưng bệnh nhân yêu cầu trám ngay chỉ vì thấy đổi màu. Câu trả lời phù hợp SGK nhất?</w:t>
+        <w:t>Câu 74. Người bệnh muốn trám ngay một đốm trắng men chưa tạo lỗ vì lo về màu sắc. Cách tiếp cận ban đầu phù hợp nhất là gì?</w:t>
       </w:r>
     </w:p>
     <w:p>
@@ -4324,7 +4324,7 @@
         <w:pStyle w:val="Question"/>
       </w:pPr>
       <w:r>
-        <w:t>Câu 76. Khi soạn đáp án cho ca “sâu ngà sâu kèm sưng mặt và sốt”, ưu tiên nào an toàn nhất?</w:t>
+        <w:t>Câu 76. Người bệnh có lỗ sâu ngà sâu, sưng mặt và sốt. Ưu tiên xử trí nào an toàn nhất?</w:t>
       </w:r>
     </w:p>
     <w:p>
@@ -4381,7 +4381,7 @@
         <w:pStyle w:val="Question"/>
       </w:pPr>
       <w:r>
-        <w:t>Câu 77. Một người lớn có hai lỗ sâu mới trong vài năm và mất khoáng cổ răng. Theo SGK, thông tin này dùng chủ yếu để làm gì?</w:t>
+        <w:t>Câu 77. Một người trưởng thành có hai lỗ sâu mới trong 12 tháng và vùng cổ răng mất khoáng. Thông tin này có giá trị chủ yếu trong bước nào?</w:t>
       </w:r>
     </w:p>
     <w:p>
@@ -4495,7 +4495,7 @@
         <w:pStyle w:val="Question"/>
       </w:pPr>
       <w:r>
-        <w:t>Câu 79. Một sinh viên xem phim thấy vùng thấu quang sâu kẽ rồi kết luận ngay “tủy hoại tử”. Sai ở đâu?</w:t>
+        <w:t>Câu 79. Phim cho thấy vùng thấu quang sâu kẽ nhưng chưa có dữ kiện về tình trạng tủy. Kết luận ngay tủy hoại tử mắc sai sót gì?</w:t>
       </w:r>
     </w:p>
     <w:p>
@@ -4552,7 +4552,7 @@
         <w:pStyle w:val="Question"/>
       </w:pPr>
       <w:r>
-        <w:t>Câu 80. Theo quan điểm của SGK, một tổn thương sâu ngà đã có lỗ cần xem xét điều gì bên cạnh phục hồi?</w:t>
+        <w:t>Câu 80. Ngoài nhu cầu phục hồi lỗ sâu ngà, bác sĩ cần đánh giá thêm những yếu tố nào?</w:t>
       </w:r>
     </w:p>
     <w:p>
@@ -4666,7 +4666,7 @@
         <w:pStyle w:val="Answer"/>
       </w:pPr>
       <w:r>
-        <w:t>Giải thích: SGK nhấn mạnh vi khuẩn tại chỗ cần nhưng chưa đủ; chế độ ăn và thời gian góp phần quyết định cân bằng mất/tái khoáng.</w:t>
+        <w:t>Giải thích: Mảng bám là yếu tố quan trọng nhưng diễn tiến còn phụ thuộc đường, thời gian tiếp xúc acid, nước bọt và các yếu tố bảo vệ.</w:t>
       </w:r>
     </w:p>
     <w:p>
@@ -4674,7 +4674,7 @@
         <w:pStyle w:val="Question"/>
       </w:pPr>
       <w:r>
-        <w:t>Câu 82. Sau một thời gian thường ngậm kẹo dính, người bệnh có mảng bám bám chắc ở rãnh răng và nhiều đợt pH mảng bám giảm. Theo cơ chế SGK, sucrose đã góp phần bằng cặp tác động nào?</w:t>
+        <w:t>Câu 82. Người thường ngậm kẹo dính có mảng bám chắc ở hố rãnh và nhiều đợt pH mảng bám giảm. Sucrose góp phần qua hai cơ chế nào?</w:t>
       </w:r>
     </w:p>
     <w:p>
@@ -4837,7 +4837,7 @@
         <w:pStyle w:val="Answer"/>
       </w:pPr>
       <w:r>
-        <w:t>Giải thích: SGK yêu cầu đánh giá chế độ ăn, ký chủ/nước bọt, fluor và yếu tố vi khuẩn; mặt kẽ cũng cần được làm sạch riêng.</w:t>
+        <w:t>Giải thích: Cần xem tần suất đường, khả năng làm sạch kẽ, nước bọt và fluor trước khi quy tổn thương mặt kẽ chỉ cho một nguyên nhân.</w:t>
       </w:r>
     </w:p>
     <w:p>
@@ -4845,7 +4845,7 @@
         <w:pStyle w:val="Question"/>
       </w:pPr>
       <w:r>
-        <w:t>Câu 85. Ở một bệnh nhân trẻ, phim và hồ sơ cách nhau 6 tháng cho thấy tổn thương tiến đến một phần ba ngoài ngà. Trong bảng nguy cơ của SGK, dữ kiện này gợi gì?</w:t>
+        <w:t>Câu 85. Phim và hồ sơ cách nhau 6 tháng cho thấy tổn thương ở người trẻ đã tiến đến một phần ba ngoài ngà. Dữ kiện này gợi điều gì?</w:t>
       </w:r>
     </w:p>
     <w:p>
@@ -4894,7 +4894,7 @@
         <w:pStyle w:val="Answer"/>
       </w:pPr>
       <w:r>
-        <w:t>Giải thích: SGK liệt kê tổn thương tiến triển đến một phần ba ngoài ngà trong 6 tháng ở người trẻ là yếu tố nguy cơ cao, nhưng vẫn cần đánh giá toàn bộ.</w:t>
+        <w:t>Giải thích: Tổn thương tiến đến ngà trong khoảng thời gian ngắn gợi bệnh đang tiến triển và nguy cơ cao; cần đánh giá các yếu tố đi kèm.</w:t>
       </w:r>
     </w:p>
     <w:p>
@@ -4902,7 +4902,7 @@
         <w:pStyle w:val="Question"/>
       </w:pPr>
       <w:r>
-        <w:t>Câu 86. Một thiếu niên chưa thấy lỗ sâu nhưng hố rãnh rất sâu chưa trám bít, không dùng fluor và ít tái khám. Cách xử lý thông tin nào đúng theo SGK?</w:t>
+        <w:t>Câu 86. Một thiếu niên chưa có lỗ sâu nhưng hố rãnh rất sâu, chưa trám bít, ít tiếp xúc fluor và hiếm khi tái khám. Bước phù hợp là gì?</w:t>
       </w:r>
     </w:p>
     <w:p>
@@ -4951,7 +4951,7 @@
         <w:pStyle w:val="Answer"/>
       </w:pPr>
       <w:r>
-        <w:t>Giải thích: Các yếu tố được SGK liệt kê thuộc nguy cơ cao; chưa có lỗ không đồng nghĩa không cần dự phòng.</w:t>
+        <w:t>Giải thích: Hố rãnh giữ mảng bám, ít fluor và không theo dõi đều là các yếu tố cần can thiệp dự phòng, dù chưa thấy lỗ sâu.</w:t>
       </w:r>
     </w:p>
     <w:p>
@@ -4959,7 +4959,7 @@
         <w:pStyle w:val="Question"/>
       </w:pPr>
       <w:r>
-        <w:t>Câu 87. Hai bệnh nhân có kết quả S. mutans tương tự. Một người có nước bọt tốt, hạn chế đường; người còn lại khô miệng và ăn ngọt nhiều lần. Theo quan niệm đa yếu tố của SGK, kết luận nào hợp lý?</w:t>
+        <w:t>Câu 87. Hai người có mức S. mutans tương tự nhau; một người có nước bọt bình thường và ít ăn đường, người kia khô miệng và ăn ngọt nhiều lần. Kết luận nào hợp lý?</w:t>
       </w:r>
     </w:p>
     <w:p>
@@ -5008,7 +5008,7 @@
         <w:pStyle w:val="Answer"/>
       </w:pPr>
       <w:r>
-        <w:t>Giải thích: Giáo trình yêu cầu kết hợp yếu tố ký chủ, vi khuẩn, ăn uống và dấu lâm sàng thay vì dùng một thông số đơn lẻ.</w:t>
+        <w:t>Giải thích: Một chỉ số vi khuẩn không đại diện toàn bộ nguy cơ; nước bọt, đường, tổn thương hiện có và các yếu tố bảo vệ cũng cần được đánh giá.</w:t>
       </w:r>
     </w:p>
     <w:p>
@@ -5016,7 +5016,7 @@
         <w:pStyle w:val="Question"/>
       </w:pPr>
       <w:r>
-        <w:t>Câu 88. Trong mô hình giải thích của SGK, pH mảng bám lần lượt giảm đến khoảng 5,0 rồi 4,3. Diễn giải nào đúng nhất về hai pha acid này?</w:t>
+        <w:t>Câu 88. pH mảng bám giảm lần lượt đến 5,0 rồi 4,3. Diễn giải nào phù hợp nhất về nguy cơ hòa tan khoáng men?</w:t>
       </w:r>
     </w:p>
     <w:p>
@@ -5065,7 +5065,7 @@
         <w:pStyle w:val="Answer"/>
       </w:pPr>
       <w:r>
-        <w:t>Giải thích: SGK nêu ngưỡng minh họa pH &lt;5,5 cho hydroxyapatite và &lt;4,5 cho fluorapatite; đó không là xét nghiệm chẩn đoán đơn độc.</w:t>
+        <w:t>Giải thích: Trong mô hình minh họa, hydroxyapatite dễ mất khoáng dưới khoảng pH 5,5 và fluorapatite dưới khoảng pH 4,5. Ngưỡng thực tế biến đổi theo nồng độ ion khoáng, nên một lần đo pH không chẩn đoán được lỗ sâu.</w:t>
       </w:r>
     </w:p>
     <w:p>
@@ -5073,7 +5073,7 @@
         <w:pStyle w:val="Question"/>
       </w:pPr>
       <w:r>
-        <w:t>Câu 89. Hai răng cối có cùng hình thái rãnh và cùng mức mảng bám; một răng vừa mọc, răng kia đã mọc nhiều năm. Theo bài học, yếu tố nào khiến răng vừa mọc cần được chú ý hơn?</w:t>
+        <w:t>Câu 89. Hai răng cối có hình thái hố rãnh và lượng mảng bám tương tự; một răng vừa mọc, răng kia đã mọc nhiều năm. Vì sao răng vừa mọc cần chú ý hơn?</w:t>
       </w:r>
     </w:p>
     <w:p>
@@ -5179,7 +5179,7 @@
         <w:pStyle w:val="Answer"/>
       </w:pPr>
       <w:r>
-        <w:t>Giải thích: SGK có ví dụ tổn thương trắng nhưng trơn bóng, vệ sinh cải thiện là bất hoạt; hoạt tính cần xét bề mặt, mảng bám và diễn tiến.</w:t>
+        <w:t>Giải thích: Bề mặt thô ráp, giữ mảng bám và mới xuất hiện gợi hoạt động; đốm trơn bóng, ổn định có thể đã bất hoạt dù vẫn trắng.</w:t>
       </w:r>
     </w:p>
     <w:p>
@@ -5236,7 +5236,7 @@
         <w:pStyle w:val="Answer"/>
       </w:pPr>
       <w:r>
-        <w:t>Giải thích: Tài liệu nhóm mô tả nhiễm fluor thường có phân bố đối xứng; tổn thương sâu răng cần xét vị trí giữ mảng bám và dấu tiến triển.</w:t>
+        <w:t>Giải thích: Vệt trắng đối xứng cần được phân biệt với nhiễm fluor; đốm khu trú ở vùng giữ mảng bám cần đánh giá sâu men và hoạt tính riêng.</w:t>
       </w:r>
     </w:p>
     <w:p>
@@ -5244,7 +5244,7 @@
         <w:pStyle w:val="Question"/>
       </w:pPr>
       <w:r>
-        <w:t>Câu 92. Nhiều răng hình thành cùng thời kỳ có khiếm khuyết men chạy ngang ở mặt ngoài, hiện diện từ khi mọc chứ không mới xuất hiện tại vùng mảng bám. Trong chẩn đoán phân biệt của tài liệu nhóm, lựa chọn nào phù hợp nhất?</w:t>
+        <w:t>Câu 92. Một số răng hình thành cùng thời kỳ có khuyết men chạy ngang ở mặt ngoài ngay từ lúc mọc, không tập trung ở vùng giữ mảng bám. Chẩn đoán nào phù hợp nhất?</w:t>
       </w:r>
     </w:p>
     <w:p>
@@ -5293,7 +5293,7 @@
         <w:pStyle w:val="Answer"/>
       </w:pPr>
       <w:r>
-        <w:t>Giải thích: Tài liệu nhóm mô tả thiểu sản men có khuyết men theo chiều ngang tại các răng cùng thời gian khoáng hóa.</w:t>
+        <w:t>Giải thích: Khuyết men xuất hiện ngay khi răng mọc, chạy ngang trên các răng cùng thời gian hình thành, gợi thiểu sản men hơn tổn thương sâu mới mắc.</w:t>
       </w:r>
     </w:p>
     <w:p>
@@ -5301,7 +5301,7 @@
         <w:pStyle w:val="Question"/>
       </w:pPr>
       <w:r>
-        <w:t>Câu 93. Trẻ nhỏ có nhiều răng cửa sữa hàm trên mất chất lan nhanh từ rìa cắn về cổ răng, phá hủy rộng thân răng. Theo đúng cách gọi trong mục chẩn đoán phân biệt của tài liệu nhóm, tên nào được dùng cho hình thái này?</w:t>
+        <w:t>Câu 93. Trẻ 3 tuổi thường ngậm bình sữa ngọt khi ngủ; nhiều răng cửa sữa hàm trên sâu lan rộng ở vùng cổ và mặt nhẵn, trong khi răng cửa hàm dưới ít tổn thương. Chẩn đoán nào phù hợp nhất?</w:t>
       </w:r>
     </w:p>
     <w:p>
@@ -5317,23 +5317,23 @@
         <w:pStyle w:val="Option"/>
       </w:pPr>
       <w:r>
-        <w:t>B. Sún răng ở trẻ em (thuật ngữ tài liệu nhóm)</w:t>
-      </w:r>
-    </w:p>
-    <w:p>
-      <w:pPr>
-        <w:pStyle w:val="Option"/>
-      </w:pPr>
-      <w:r>
-        <w:t>C. Nhiễm fluor đối xứng không mất chất</w:t>
-      </w:r>
-    </w:p>
-    <w:p>
-      <w:pPr>
-        <w:pStyle w:val="Option"/>
-      </w:pPr>
-      <w:r>
-        <w:t>D. Đốm trắng bất hoạt đơn độc</w:t>
+        <w:t>B. Sâu răng sớm ở trẻ nhỏ</w:t>
+      </w:r>
+    </w:p>
+    <w:p>
+      <w:pPr>
+        <w:pStyle w:val="Option"/>
+      </w:pPr>
+      <w:r>
+        <w:t>C. Nhiễm fluor đối xứng, không mất chất</w:t>
+      </w:r>
+    </w:p>
+    <w:p>
+      <w:pPr>
+        <w:pStyle w:val="Option"/>
+      </w:pPr>
+      <w:r>
+        <w:t>D. Một đốm trắng bất hoạt đơn độc</w:t>
       </w:r>
     </w:p>
     <w:p>
@@ -5350,7 +5350,7 @@
         <w:pStyle w:val="Answer"/>
       </w:pPr>
       <w:r>
-        <w:t>Giải thích: Mục 4.1.4 và Hình 4.6 của tài liệu nhóm dùng tên 'sún răng' cho mô tả này. Đây là nhận diện thuật ngữ trong nguồn học; hình thái đơn lẻ chưa đủ thay cho khám và chẩn đoán phân biệt ở trẻ cụ thể.</w:t>
+        <w:t>Giải thích: Sâu lan rộng ở răng cửa sữa hàm trên cùng thói quen tiếp xúc đồ uống ngọt khi ngủ gợi sâu răng sớm ở trẻ nhỏ; vẫn cần khám đầy đủ và đánh giá mức độ từng răng.</w:t>
       </w:r>
     </w:p>
     <w:p>
@@ -5358,7 +5358,7 @@
         <w:pStyle w:val="Question"/>
       </w:pPr>
       <w:r>
-        <w:t>Câu 94. Ở răng 34, khuyết cổ răng hình chữ V, bờ sắc và đáy cứng; ở răng 35, khuyết cổ răng giữ mảng bám, đáy mềm. Ghép nhận định nào sát tài liệu nhóm nhất?</w:t>
+        <w:t>Câu 94. Răng 34 có khuyết cổ hình chữ V, bờ sắc, đáy cứng; răng 35 có khuyết cổ giữ mảng bám, đáy mềm. Nhận định nào phù hợp nhất?</w:t>
       </w:r>
     </w:p>
     <w:p>
@@ -5415,39 +5415,39 @@
         <w:pStyle w:val="Question"/>
       </w:pPr>
       <w:r>
-        <w:t>Câu 95. Một hố rãnh đổi màu vàng nâu rõ ngay khi còn ướt nhưng sau làm sạch không thấy lỗ, chưa lộ ngà. Nếu buộc dùng bảng S1/S2/S3 của tài liệu nhóm, xếp nhóm nào trước?</w:t>
-      </w:r>
-    </w:p>
-    <w:p>
-      <w:pPr>
-        <w:pStyle w:val="Option"/>
-      </w:pPr>
-      <w:r>
-        <w:t>A. S3 vì mọi màu nâu đều là lỗ sâu lớn</w:t>
-      </w:r>
-    </w:p>
-    <w:p>
-      <w:pPr>
-        <w:pStyle w:val="Option"/>
-      </w:pPr>
-      <w:r>
-        <w:t>B. S1, đồng thời tiếp tục đánh giá hoạt tính và nguy cơ</w:t>
-      </w:r>
-    </w:p>
-    <w:p>
-      <w:pPr>
-        <w:pStyle w:val="Option"/>
-      </w:pPr>
-      <w:r>
-        <w:t>C. Hoại tử tủy vì rãnh đổi màu</w:t>
-      </w:r>
-    </w:p>
-    <w:p>
-      <w:pPr>
-        <w:pStyle w:val="Option"/>
-      </w:pPr>
-      <w:r>
-        <w:t>D. Răng lành mạnh chắc chắn dù đổi màu rõ</w:t>
+        <w:t>Câu 95. Hố rãnh mặt nhai đổi màu nâu nhưng sau làm sạch chưa thấy lỗ hay lộ ngà. Bước đánh giá nào phù hợp nhất trước khi quyết định điều trị?</w:t>
+      </w:r>
+    </w:p>
+    <w:p>
+      <w:pPr>
+        <w:pStyle w:val="Option"/>
+      </w:pPr>
+      <w:r>
+        <w:t>A. Khẳng định sâu ngà lớn chỉ dựa vào màu nâu</w:t>
+      </w:r>
+    </w:p>
+    <w:p>
+      <w:pPr>
+        <w:pStyle w:val="Option"/>
+      </w:pPr>
+      <w:r>
+        <w:t>B. Làm sạch, thổi khô, đánh giá bề mặt và nguy cơ trước khi kết luận</w:t>
+      </w:r>
+    </w:p>
+    <w:p>
+      <w:pPr>
+        <w:pStyle w:val="Option"/>
+      </w:pPr>
+      <w:r>
+        <w:t>C. Điều trị tủy dù chưa có dấu bệnh tủy</w:t>
+      </w:r>
+    </w:p>
+    <w:p>
+      <w:pPr>
+        <w:pStyle w:val="Option"/>
+      </w:pPr>
+      <w:r>
+        <w:t>D. Bỏ qua hoàn toàn vì chưa thấy đau</w:t>
       </w:r>
     </w:p>
     <w:p>
@@ -5464,7 +5464,7 @@
         <w:pStyle w:val="Answer"/>
       </w:pPr>
       <w:r>
-        <w:t>Giải thích: Bảng của nhóm đặt đổi màu vàng/nâu khu trú ở hố rãnh khi còn ướt vào giai đoạn sớm S1; ký hiệu không thay đánh giá lâm sàng đầy đủ.</w:t>
+        <w:t>Giải thích: Màu nâu ở hố rãnh một mình không chứng minh có lỗ sâu hoặc tổn thương ngà; cần làm sạch, thổi khô và khám bề mặt cùng các yếu tố nguy cơ.</w:t>
       </w:r>
     </w:p>
     <w:p>
@@ -5472,23 +5472,23 @@
         <w:pStyle w:val="Question"/>
       </w:pPr>
       <w:r>
-        <w:t>Câu 96. Một vệt màu ở hố rãnh biến mất sau làm sạch; sau thổi khô 5 giây không có đốm trắng, mất liên tục men hay lỗ. Theo bảng chẩn đoán của tài liệu nhóm, mô tả nào phù hợp nhất?</w:t>
-      </w:r>
-    </w:p>
-    <w:p>
-      <w:pPr>
-        <w:pStyle w:val="Option"/>
-      </w:pPr>
-      <w:r>
-        <w:t>A. Chưa có dấu lâm sàng để xếp là sâu; bề mặt phù hợp nhóm răng lành mạnh trong bảng</w:t>
-      </w:r>
-    </w:p>
-    <w:p>
-      <w:pPr>
-        <w:pStyle w:val="Option"/>
-      </w:pPr>
-      <w:r>
-        <w:t>B. Chắc chắn là S3 vì trước đó có vệt màu</w:t>
+        <w:t>Câu 96. Vệt màu ở hố rãnh biến mất sau làm sạch; sau thổi khô không có đốm trắng, mất liên tục men hay lỗ. Nhận định nào phù hợp nhất?</w:t>
+      </w:r>
+    </w:p>
+    <w:p>
+      <w:pPr>
+        <w:pStyle w:val="Option"/>
+      </w:pPr>
+      <w:r>
+        <w:t>A. Chưa có dấu lâm sàng đủ để xếp là sâu răng tại vị trí này</w:t>
+      </w:r>
+    </w:p>
+    <w:p>
+      <w:pPr>
+        <w:pStyle w:val="Option"/>
+      </w:pPr>
+      <w:r>
+        <w:t>B. Chắc chắn đã có lỗ sâu ngà chỉ vì trước đó có vệt màu</w:t>
       </w:r>
     </w:p>
     <w:p>
@@ -5521,7 +5521,7 @@
         <w:pStyle w:val="Answer"/>
       </w:pPr>
       <w:r>
-        <w:t>Giải thích: Bảng nhóm mô tả răng lành mạnh khi không có lỗ hoặc đốm nghi mất khoáng sau thổi khô; tiếp tục theo dõi nếu nguy cơ cao.</w:t>
+        <w:t>Giải thích: Không có dấu mất khoáng sau làm sạch và thổi khô thì chưa đủ căn cứ chẩn đoán sâu tại vị trí này; tiếp tục theo dõi theo nguy cơ.</w:t>
       </w:r>
     </w:p>
     <w:p>
@@ -5529,7 +5529,7 @@
         <w:pStyle w:val="Question"/>
       </w:pPr>
       <w:r>
-        <w:t>Câu 97. Một răng có nghi sâu kẽ khó nhìn trực tiếp; răng khác đã điều trị tủy có đau khi gõ và cần xem vùng quanh chóp. Theo tài liệu nhóm, cặp phim ưu tiên tương ứng là gì?</w:t>
+        <w:t>Câu 97. Một răng nghi sâu kẽ khó nhìn trực tiếp; răng khác đau khi gõ và cần đánh giá vùng quanh chóp. Cặp phim phù hợp tương ứng là gì?</w:t>
       </w:r>
     </w:p>
     <w:p>
@@ -5578,7 +5578,7 @@
         <w:pStyle w:val="Answer"/>
       </w:pPr>
       <w:r>
-        <w:t>Giải thích: Tài liệu nhóm nêu phim cánh cắn hữu ích cho vùng kẽ, còn phim cận chóp hỗ trợ đánh giá cuống răng và xương ổ.</w:t>
+        <w:t>Giải thích: Phim cánh cắn hữu ích cho tổn thương mặt kẽ, còn phim cận chóp hỗ trợ đánh giá vùng cuống răng và xương quanh chóp.</w:t>
       </w:r>
     </w:p>
     <w:p>
@@ -5635,7 +5635,7 @@
         <w:pStyle w:val="Answer"/>
       </w:pPr>
       <w:r>
-        <w:t>Giải thích: SGK cho phép dùng thông tin X-quang để hỗ trợ chẩn đoán tổn thương, đồng thời yêu cầu đánh giá nguy cơ và hoạt tính; phim không tự quyết định có lỗ.</w:t>
+        <w:t>Giải thích: Vùng thấu quang gợi mất khoáng; phim không tự xác định bề mặt đã tạo lỗ, nên cần kết hợp khám, nguy cơ và hoạt tính.</w:t>
       </w:r>
     </w:p>
     <w:p>
@@ -5757,7 +5757,7 @@
         <w:pStyle w:val="Question"/>
       </w:pPr>
       <w:r>
-        <w:t>Câu 101. Trong một buổi khám, mặt A chỉ nghi ngờ đổi màu chưa xác nhận mất khoáng; mặt B có đốm trắng đục còn nguyên bề mặt; mặt C có lỗ sâu thấy rõ. Thứ tự ba nhóm chẩn đoán chung trong SGK cho A-B-C là gì?</w:t>
+        <w:t>Câu 101. Khi khám, mặt A chỉ đổi màu chưa xác nhận mất khoáng, mặt B có đốm trắng đục còn nguyên bề mặt, mặt C có lỗ rõ. Cách mô tả A–B–C phù hợp nhất là gì?</w:t>
       </w:r>
     </w:p>
     <w:p>
@@ -5806,7 +5806,7 @@
         <w:pStyle w:val="Answer"/>
       </w:pPr>
       <w:r>
-        <w:t>Giải thích: SGK chia chung thành sâu răng nghi ngờ, khởi phát dạng đốm trắng đục và lỗ sâu thực sự; mức chắc chắn tăng theo dấu hiện diện.</w:t>
+        <w:t>Giải thích: Mặt A mới ở mức nghi ngờ, mặt B gợi sang thương khởi phát còn nguyên bề mặt, còn mặt C đã có lỗ rõ; mỗi mặt cần đánh giá thêm độ sâu và hoạt tính.</w:t>
       </w:r>
     </w:p>
     <w:p>
@@ -5814,7 +5814,7 @@
         <w:pStyle w:val="Question"/>
       </w:pPr>
       <w:r>
-        <w:t>Câu 102. Một vùng kẽ đổi màu nhẹ, khó quan sát, người bệnh nguy cơ cao nhưng chưa rõ có lỗ hay không. Lựa chọn nào đi đúng thứ tự chẩn đoán của bài học?</w:t>
+        <w:t>Câu 102. Một vùng kẽ đổi màu nhẹ, khó quan sát; người bệnh nguy cơ cao nhưng chưa rõ có lỗ hay không. Trình tự đánh giá nào phù hợp?</w:t>
       </w:r>
     </w:p>
     <w:p>
@@ -5871,7 +5871,7 @@
         <w:pStyle w:val="Question"/>
       </w:pPr>
       <w:r>
-        <w:t>Câu 103. Một đốm men còn nguyên bề mặt chỉ xuất hiện sau thổi khô. Người khám định ấn mạnh thám trâm để “xác nhận” có lỗ. Cách điều chỉnh nào phù hợp nhất với tài liệu nhóm?</w:t>
+        <w:t>Câu 103. Một đốm trắng men còn nguyên bề mặt chỉ hiện rõ sau thổi khô. Người khám định ấn mạnh thám trâm để xác nhận lỗ sâu. Nên điều chỉnh thao tác thế nào?</w:t>
       </w:r>
     </w:p>
     <w:p>
@@ -5920,7 +5920,7 @@
         <w:pStyle w:val="Answer"/>
       </w:pPr>
       <w:r>
-        <w:t>Giải thích: Tài liệu nhóm yêu cầu thao tác thám trâm nhẹ, tránh gây tổn thương; dấu trắng sau thổi khô có thể là giai đoạn sớm chưa tạo lỗ.</w:t>
+        <w:t>Giải thích: Ấn mạnh có thể làm vỡ bề mặt sang thương men sớm; nên quan sát răng đã làm sạch và chỉ thăm nhẹ khi thật cần.</w:t>
       </w:r>
     </w:p>
     <w:p>
@@ -5928,7 +5928,7 @@
         <w:pStyle w:val="Question"/>
       </w:pPr>
       <w:r>
-        <w:t>Câu 104. Ở một sang thương đã vượt đường nối men-ngà, người học cần sắp xếp: acid phá khoáng mở đường, vi khuẩn vào ống ngà, collagen khuôn ngà tổn thương. Trình tự nào sát SGK nhất?</w:t>
+        <w:t>Câu 104. Sang thương sâu đã vượt đường nối men–ngà. Trình tự nào mô tả hợp lý quá trình acid, vi khuẩn và khuôn collagen trong sâu ngà?</w:t>
       </w:r>
     </w:p>
     <w:p>
@@ -5977,7 +5977,7 @@
         <w:pStyle w:val="Answer"/>
       </w:pPr>
       <w:r>
-        <w:t>Giải thích: SGK mô tả acid gây phá hủy mở đường cho một lượng vi khuẩn vào ống ngà, sau đó khuôn ngà yếu đi và collagen bị tổn thương.</w:t>
+        <w:t>Giải thích: Acid gây mất khoáng và làm cấu trúc ngà yếu đi; vi khuẩn xâm nhập ống ngà, sau đó khuôn collagen tiếp tục bị tổn thương.</w:t>
       </w:r>
     </w:p>
     <w:p>
@@ -5985,7 +5985,7 @@
         <w:pStyle w:val="Question"/>
       </w:pPr>
       <w:r>
-        <w:t>Câu 105. Một tiêu bản sâu ngà cho thấy tổn thương không còn giới hạn trong lòng ống ngà mà lan tới vùng giữa các ống. Theo mô tả tiến triển của SGK, cấu trúc khoáng nào đang bị hòa tan?</w:t>
+        <w:t>Câu 105. Tiêu bản sâu ngà cho thấy tổn thương lan ra ngoài lòng ống ngà đến vùng giữa các ống. Cấu trúc khoáng nào đang bị ảnh hưởng?</w:t>
       </w:r>
     </w:p>
     <w:p>
@@ -6034,7 +6034,7 @@
         <w:pStyle w:val="Answer"/>
       </w:pPr>
       <w:r>
-        <w:t>Giải thích: Sau tổn thương collagen, SGK nêu hòa tan tinh thể quanh ống ngà, ngà gian ống và các thành phần khác.</w:t>
+        <w:t>Giải thích: Tổn thương lan rộng có thể làm hòa tan tinh thể khoáng quanh ống ngà và trong ngà gian ống.</w:t>
       </w:r>
     </w:p>
     <w:p>
@@ -6042,7 +6042,7 @@
         <w:pStyle w:val="Question"/>
       </w:pPr>
       <w:r>
-        <w:t>Câu 106. Ở một răng sâu tiến gần tủy, hình ảnh mô học gợi kết tủa khoáng làm bít ống ngà và một lớp ngà mới phía tủy. Ghép tên hai phản ứng theo tài liệu nhóm thế nào?</w:t>
+        <w:t>Câu 106. Ở răng sâu tiến gần tủy, khoáng lắng đọng làm bít ống ngà và một lớp ngà mới hình thành phía tủy. Hai phản ứng này lần lượt là gì?</w:t>
       </w:r>
     </w:p>
     <w:p>
@@ -6091,7 +6091,7 @@
         <w:pStyle w:val="Answer"/>
       </w:pPr>
       <w:r>
-        <w:t>Giải thích: Ngà xơ cứng giảm tính thấm ống ngà; tài liệu nhóm bổ sung ngà thứ ba do nguyên bào tạo ngà tạo ra gần tủy.</w:t>
+        <w:t>Giải thích: Lắng đọng khoáng làm giảm tính thấm ống ngà gọi là xơ cứng; ngà mới được tạo ở phía tủy là ngà thứ ba.</w:t>
       </w:r>
     </w:p>
     <w:p>
@@ -6099,7 +6099,7 @@
         <w:pStyle w:val="Question"/>
       </w:pPr>
       <w:r>
-        <w:t>Câu 107. Khi khảo sát đáy sang thương sâu ngà, một vùng ngà còn khung collagen, còn phản ứng cảm giác và không có bằng chứng vi khuẩn xâm nhập nhiều. Theo Bảng 1.1 SGK, vùng đó gần nhất với gì?</w:t>
+        <w:t>Câu 107. Đáy lỗ sâu có vùng ngà còn khung collagen, còn cảm giác và ít bằng chứng vi khuẩn xâm nhập. Vùng đó phù hợp nhất với mô nào?</w:t>
       </w:r>
     </w:p>
     <w:p>
@@ -6156,7 +6156,7 @@
         <w:pStyle w:val="Question"/>
       </w:pPr>
       <w:r>
-        <w:t>Câu 108. Trong sơ đồ sâu hố rãnh mặt nhai lan từ men vào ngà của bài học, đường xâm nhập hẹp ở mặt men, rộng tại đường nối men-ngà rồi thu lại về hướng tủy. Cách giải thích hình học nào phù hợp với sơ đồ này?</w:t>
+        <w:t>Câu 108. Ở sâu hố rãnh mặt nhai, đường tổn thương hẹp ở bề mặt men, rộng gần đường nối men–ngà rồi thu lại về hướng tủy. Hình học nào giải thích mô tả này?</w:t>
       </w:r>
     </w:p>
     <w:p>
@@ -6205,7 +6205,7 @@
         <w:pStyle w:val="Answer"/>
       </w:pPr>
       <w:r>
-        <w:t>Giải thích: Trong sơ đồ hình nón của SGK, hai phần có đáy tại đường nối men-ngà: phần men hướng đỉnh ra mặt ngoài, phần ngà hướng đỉnh vào tủy. Đây là mô hình minh họa của kiểu tổn thương được hỏi, không áp cứng cho mọi mặt răng.</w:t>
+        <w:t>Giải thích: Trong kiểu sâu hố rãnh này, phần tổn thương trong men và trong ngà đều rộng gần đường nối men–ngà, rồi thu hẹp lần lượt về mặt men và phía tủy. Đây là sơ đồ minh họa, không áp cứng cho mọi mặt răng.</w:t>
       </w:r>
     </w:p>
     <w:p>
@@ -6213,7 +6213,7 @@
         <w:pStyle w:val="Question"/>
       </w:pPr>
       <w:r>
-        <w:t>Câu 109. Một lỗ sâu ngà được giữ sạch, không còn mảng bám đọng; sau vài tháng đáy ngà sậm màu nhưng cứng hơn và người bệnh bớt ê. Suy luận nào phù hợp ví dụ của SGK?</w:t>
+        <w:t>Câu 109. Một lỗ sâu ngà được giữ sạch, không còn mảng bám đọng; sau vài tháng đáy ngà sậm màu nhưng cứng hơn và người bệnh bớt ê. Kết luận nào hợp lý nhất?</w:t>
       </w:r>
     </w:p>
     <w:p>
@@ -6262,7 +6262,7 @@
         <w:pStyle w:val="Answer"/>
       </w:pPr>
       <w:r>
-        <w:t>Giải thích: SGK Hình 1.3 mô tả ngà sậm và cứng hơn sau kiểm soát mảng bám; hoạt tính không được suy chỉ từ màu.</w:t>
+        <w:t>Giải thích: Đáy ngà cứng hơn cùng kiểm soát mảng bám và giảm ê gợi tổn thương có thể đã ngừng tiến triển; màu sậm đơn lẻ không cho biết hoạt tính.</w:t>
       </w:r>
     </w:p>
     <w:p>
@@ -6270,7 +6270,7 @@
         <w:pStyle w:val="Question"/>
       </w:pPr>
       <w:r>
-        <w:t>Câu 110. Một vùng sâu ngà đã ổn định sau kiểm soát mảng bám nhưng vẫn còn lỗ mất chất giữ thức ăn. Kết luận nào giữ đúng cả hai ý trong SGK?</w:t>
+        <w:t>Câu 110. Một vùng sâu ngà đã ổn định sau kiểm soát mảng bám nhưng vẫn còn lỗ giữ thức ăn. Kế hoạch tiếp theo nào phù hợp nhất?</w:t>
       </w:r>
     </w:p>
     <w:p>
@@ -6319,7 +6319,7 @@
         <w:pStyle w:val="Answer"/>
       </w:pPr>
       <w:r>
-        <w:t>Giải thích: SGK vừa mô tả khả năng ngà dưới tổn thương tái khoáng, vừa nhấn mạnh phục hồi tổn thương có lỗ và xử lý căn nguyên.</w:t>
+        <w:t>Giải thích: Tổn thương có thể ngừng tiến triển nhưng lỗ giữ thức ăn vẫn cần đánh giá khả năng làm sạch, nhu cầu phục hồi và kiểm soát nguy cơ lâu dài.</w:t>
       </w:r>
     </w:p>
     <w:p>
@@ -6433,7 +6433,7 @@
         <w:pStyle w:val="Answer"/>
       </w:pPr>
       <w:r>
-        <w:t>Giải thích: Tài liệu nhóm dùng đặc điểm đau tự nhiên, về đêm và kéo dài để gợi bệnh tủy; cần khám xác nhận, không chẩn đoán chỉ từ một triệu chứng.</w:t>
+        <w:t>Giải thích: Đau tự nhiên về đêm và kéo dài sau lạnh gợi bệnh lý tủy hơn đau thoáng qua do ngọt; cần khám xác nhận.</w:t>
       </w:r>
     </w:p>
     <w:p>
@@ -6441,7 +6441,7 @@
         <w:pStyle w:val="Question"/>
       </w:pPr>
       <w:r>
-        <w:t>Câu 113. Một răng sâu có tủy hoại tử và phim cận chóp gợi tổn thương quanh chóp, nhưng hiện không sưng mặt, không sốt. Một sinh viên kết luận bệnh nhân đã viêm mô tế bào và nhiễm khuẩn huyết. Chỉnh suy luận này thế nào?</w:t>
+        <w:t>Câu 113. Một răng sâu có tủy hoại tử và phim cận chóp gợi tổn thương quanh chóp, nhưng hiện không sưng mặt hoặc sốt. Kết luận nào tránh suy diễn quá mức?</w:t>
       </w:r>
     </w:p>
     <w:p>
@@ -6490,7 +6490,7 @@
         <w:pStyle w:val="Answer"/>
       </w:pPr>
       <w:r>
-        <w:t>Giải thích: SGK mô tả các tầng lan nhiễm khuẩn từ tủy đến quanh chóp, rồi mới có thể đến mô mềm hoặc toàn thân. Phim gợi tổn thương quanh chóp không tự chứng minh các tầng biến chứng xa khi thiếu dấu lâm sàng tương ứng.</w:t>
+        <w:t>Giải thích: Tủy hoại tử và hình ảnh quanh chóp gợi biến chứng tại chóp; chưa có dấu lâm sàng để kết luận nhiễm khuẩn đã lan mô mặt hay toàn thân.</w:t>
       </w:r>
     </w:p>
     <w:p>
@@ -6498,7 +6498,7 @@
         <w:pStyle w:val="Question"/>
       </w:pPr>
       <w:r>
-        <w:t>Câu 114. Một người có răng từng đau nhiều, nay ít đau nhưng có đường rò mủ ở ngách lợi cạnh răng sâu lớn. Theo chuỗi biến chứng tài liệu nhóm, tình huống này gợi nhất điều gì?</w:t>
+        <w:t>Câu 114. Một răng từng đau nhiều, nay ít đau nhưng có đường rò mủ ở ngách lợi cạnh lỗ sâu lớn. Tình trạng nào cần được ưu tiên đánh giá?</w:t>
       </w:r>
     </w:p>
     <w:p>
@@ -6547,7 +6547,7 @@
         <w:pStyle w:val="Answer"/>
       </w:pPr>
       <w:r>
-        <w:t>Giải thích: Tài liệu nhóm nêu rò mủ mạn có thể xuất hiện khi nhiễm khuẩn từ tủy hoại tử kéo dài ở vùng quanh chóp.</w:t>
+        <w:t>Giải thích: Đường rò cạnh răng sâu lớn có thể xuất phát từ nhiễm khuẩn quanh chóp mạn sau hoại tử tủy; cần khám để xác định nguồn rò.</w:t>
       </w:r>
     </w:p>
     <w:p>
@@ -6555,7 +6555,7 @@
         <w:pStyle w:val="Question"/>
       </w:pPr>
       <w:r>
-        <w:t>Câu 115. Sau sâu răng kéo dài, một người có tủy hoại tử, áp xe quanh chóp rồi sưng lan mô mặt. Chuỗi giải thích nào phù hợp SGK nhất?</w:t>
+        <w:t>Câu 115. Sau sâu răng kéo dài, người bệnh có tủy hoại tử, áp xe quanh chóp rồi sưng lan mô mặt. Đường lan nhiễm khuẩn nào giải thích diễn tiến này?</w:t>
       </w:r>
     </w:p>
     <w:p>
@@ -6604,7 +6604,7 @@
         <w:pStyle w:val="Answer"/>
       </w:pPr>
       <w:r>
-        <w:t>Giải thích: SGK mô tả diễn tiến từ tổn thương tủy qua lỗ chóp và có thể tới mô mềm, xương; mức lan rộng không xảy ra ở mọi bệnh nhân.</w:t>
+        <w:t>Giải thích: Vi khuẩn từ tủy hoại tử có thể đi qua lỗ chóp đến mô quanh chóp rồi lan mô mềm; diễn tiến nặng này không xảy ra ở mọi bệnh nhân sâu răng.</w:t>
       </w:r>
     </w:p>
     <w:p>
@@ -6612,7 +6612,7 @@
         <w:pStyle w:val="Question"/>
       </w:pPr>
       <w:r>
-        <w:t>Câu 116. Một răng cối có hố rãnh sâu chưa tổn thương; các răng kế bên lại đọng mảng bám ở kẽ dù mặt nhai sạch. Cặp biện pháp nào nhắm đúng hai vị trí theo SGK?</w:t>
+        <w:t>Câu 116. Một răng cối có hố rãnh sâu chưa tổn thương; các răng bên cạnh đọng mảng bám ở kẽ dù mặt nhai sạch. Cặp biện pháp nào phù hợp với hai vị trí?</w:t>
       </w:r>
     </w:p>
     <w:p>
@@ -6718,7 +6718,7 @@
         <w:pStyle w:val="Answer"/>
       </w:pPr>
       <w:r>
-        <w:t>Giải thích: SGK xem tụt nướu và tiền căn sâu chân răng là dấu nguy cơ người lớn; vùng đổi màu cần khám bề mặt để phân biệt hoạt tính và nguyên nhân.</w:t>
+        <w:t>Giải thích: Tụt nướu và tiền căn sâu chân răng làm tăng nguy cơ ở vùng chân răng lộ; độ cứng bề mặt, mảng bám và diễn tiến giúp đánh giá hoạt tính.</w:t>
       </w:r>
     </w:p>
     <w:p>
@@ -6726,39 +6726,39 @@
         <w:pStyle w:val="Question"/>
       </w:pPr>
       <w:r>
-        <w:t>Câu 118. Một sinh viên đọc SGK thấy chlorhexidine trong phác đồ sâu răng trầm trọng, rồi đề nghị mọi bệnh nhân có đốm trắng tự dùng hằng ngày lâu dài. Cách sửa nào phù hợp nhất?</w:t>
-      </w:r>
-    </w:p>
-    <w:p>
-      <w:pPr>
-        <w:pStyle w:val="Option"/>
-      </w:pPr>
-      <w:r>
-        <w:t>A. Bỏ qua hoàn toàn việc vệ sinh và chế độ ăn nếu dùng chlorhexidine</w:t>
-      </w:r>
-    </w:p>
-    <w:p>
-      <w:pPr>
-        <w:pStyle w:val="Option"/>
-      </w:pPr>
-      <w:r>
-        <w:t>B. Giữ đề nghị vì một đốm trắng luôn đòi hỏi chlorhexidine dài hạn</w:t>
-      </w:r>
-    </w:p>
-    <w:p>
-      <w:pPr>
-        <w:pStyle w:val="Option"/>
-      </w:pPr>
-      <w:r>
-        <w:t>C. Chỉ dùng chlorhexidine để trám bít hố rãnh</w:t>
-      </w:r>
-    </w:p>
-    <w:p>
-      <w:pPr>
-        <w:pStyle w:val="Option"/>
-      </w:pPr>
-      <w:r>
-        <w:t>D. Hiểu chlorhexidine là biện pháp chọn lọc trong bối cảnh giáo trình; chỉ dùng khi người khám chỉ định sau đánh giá nguy cơ và hướng dẫn hiện hành</w:t>
+        <w:t>Câu 118. Người có đốm trắng men muốn tự dùng chlorhexidine nhiều tháng thay kem fluor và chải răng. Tư vấn nào đúng?</w:t>
+      </w:r>
+    </w:p>
+    <w:p>
+      <w:pPr>
+        <w:pStyle w:val="Option"/>
+      </w:pPr>
+      <w:r>
+        <w:t>A. Dùng chlorhexidine để khỏi cần kiểm soát chế độ ăn</w:t>
+      </w:r>
+    </w:p>
+    <w:p>
+      <w:pPr>
+        <w:pStyle w:val="Option"/>
+      </w:pPr>
+      <w:r>
+        <w:t>B. Tự dùng nhiều tháng vì mọi đốm trắng đều cần sát khuẩn kéo dài</w:t>
+      </w:r>
+    </w:p>
+    <w:p>
+      <w:pPr>
+        <w:pStyle w:val="Option"/>
+      </w:pPr>
+      <w:r>
+        <w:t>C. Dùng chlorhexidine thay vật liệu trám bít hố rãnh</w:t>
+      </w:r>
+    </w:p>
+    <w:p>
+      <w:pPr>
+        <w:pStyle w:val="Option"/>
+      </w:pPr>
+      <w:r>
+        <w:t>D. Kiểm soát đường, mảng bám và fluor; chlorhexidine chỉ khi có chỉ định</w:t>
       </w:r>
     </w:p>
     <w:p>
@@ -6775,7 +6775,7 @@
         <w:pStyle w:val="Answer"/>
       </w:pPr>
       <w:r>
-        <w:t>Giải thích: SGK nêu dùng trong trường hợp nặng khi fluor chưa đủ, và có đợt ngắn trong phác đồ; không chuyển thành chỉ định phổ quát tự điều trị.</w:t>
+        <w:t>Giải thích: Chlorhexidine không thay cho kiểm soát mảng bám, đường và fluor. Chỉ dùng thuốc sát khuẩn khi có chỉ định sau đánh giá cá thể.</w:t>
       </w:r>
     </w:p>
     <w:p>
@@ -6783,39 +6783,39 @@
         <w:pStyle w:val="Question"/>
       </w:pPr>
       <w:r>
-        <w:t>Câu 119. SGK ghi trẻ dưới 2 tuổi không nên dùng kem fluor, còn tài liệu nhóm cho phép lượng rất nhỏ. Khi làm bài và tư vấn ngoài thực tế, cách xử lý mâu thuẫn nào đúng nhất?</w:t>
-      </w:r>
-    </w:p>
-    <w:p>
-      <w:pPr>
-        <w:pStyle w:val="Option"/>
-      </w:pPr>
-      <w:r>
-        <w:t>A. Bỏ qua nguy cơ nuốt vì fluor không thể có tác dụng bất lợi</w:t>
-      </w:r>
-    </w:p>
-    <w:p>
-      <w:pPr>
-        <w:pStyle w:val="Option"/>
-      </w:pPr>
-      <w:r>
-        <w:t>B. Nêu rõ hai tài liệu không thống nhất; với trẻ cụ thể phải kiểm tra khuyến cáo cập nhật, lượng kem và nguy cơ nuốt</w:t>
-      </w:r>
-    </w:p>
-    <w:p>
-      <w:pPr>
-        <w:pStyle w:val="Option"/>
-      </w:pPr>
-      <w:r>
-        <w:t>C. Tự chọn nồng độ và lượng kem chỉ từ tuổi mà không xét nguồn fluor khác</w:t>
-      </w:r>
-    </w:p>
-    <w:p>
-      <w:pPr>
-        <w:pStyle w:val="Option"/>
-      </w:pPr>
-      <w:r>
-        <w:t>D. Lấy đồng thời cả hai câu thành chỉ định tuyệt đối cho mọi trẻ</w:t>
+        <w:t>Câu 119. Phụ huynh trẻ 18 tháng vừa mọc răng hỏi về kem fluor. Hướng dẫn nào đúng?</w:t>
+      </w:r>
+    </w:p>
+    <w:p>
+      <w:pPr>
+        <w:pStyle w:val="Option"/>
+      </w:pPr>
+      <w:r>
+        <w:t>A. Cho trẻ tự bóp đầy kem lên bàn chải và tự chải</w:t>
+      </w:r>
+    </w:p>
+    <w:p>
+      <w:pPr>
+        <w:pStyle w:val="Option"/>
+      </w:pPr>
+      <w:r>
+        <w:t>B. Người chăm sóc dùng kem fluor lượng cỡ hạt gạo và giám sát khi chải</w:t>
+      </w:r>
+    </w:p>
+    <w:p>
+      <w:pPr>
+        <w:pStyle w:val="Option"/>
+      </w:pPr>
+      <w:r>
+        <w:t>C. Chờ đến 6 tuổi mới được dùng kem có fluor trong mọi trường hợp</w:t>
+      </w:r>
+    </w:p>
+    <w:p>
+      <w:pPr>
+        <w:pStyle w:val="Option"/>
+      </w:pPr>
+      <w:r>
+        <w:t>D. Tự cho uống viên fluor mỗi ngày thay chải răng</w:t>
       </w:r>
     </w:p>
     <w:p>
@@ -6832,7 +6832,7 @@
         <w:pStyle w:val="Answer"/>
       </w:pPr>
       <w:r>
-        <w:t>Giải thích: Hai nguồn trong thư mục khác nhau ở chỉ dẫn trẻ nhỏ; học liệu không đủ để ấn định một phác đồ hiện hành cho mọi trẻ.</w:t>
+        <w:t>Giải thích: Từ khi mọc răng đầu tiên đến trước 3 tuổi, dùng kem fluor lượng cỡ hạt gạo; người chăm sóc chải và giám sát để hạn chế nuốt kem.</w:t>
       </w:r>
     </w:p>
     <w:p>
@@ -6840,39 +6840,39 @@
         <w:pStyle w:val="Question"/>
       </w:pPr>
       <w:r>
-        <w:t>Câu 120. Một sinh viên lấy câu SGK “kem fluor dùng từ khi răng mọc có hiệu quả hơn bổ sung fluor từ lúc mới sinh” để tự kê viên fluor cho trẻ sơ sinh. Sai sót chính ở đâu?</w:t>
-      </w:r>
-    </w:p>
-    <w:p>
-      <w:pPr>
-        <w:pStyle w:val="Option"/>
-      </w:pPr>
-      <w:r>
-        <w:t>A. Không trích đúng tên thương mại của viên</w:t>
-      </w:r>
-    </w:p>
-    <w:p>
-      <w:pPr>
-        <w:pStyle w:val="Option"/>
-      </w:pPr>
-      <w:r>
-        <w:t>B. Không yêu cầu xét nghiệm S. mutans trước mọi lần chải răng</w:t>
-      </w:r>
-    </w:p>
-    <w:p>
-      <w:pPr>
-        <w:pStyle w:val="Option"/>
-      </w:pPr>
-      <w:r>
-        <w:t>C. Biến nhận xét so sánh trong giáo trình thành chỉ định cá thể hóa mà chưa đánh giá nguồn fluor, tuổi và khuyến cáo cập nhật</w:t>
-      </w:r>
-    </w:p>
-    <w:p>
-      <w:pPr>
-        <w:pStyle w:val="Option"/>
-      </w:pPr>
-      <w:r>
-        <w:t>D. Không áp dụng sealant cho răng chưa mọc</w:t>
+        <w:t>Câu 120. Trẻ sơ sinh chưa mọc răng. Cha mẹ muốn tự cho uống viên fluor mỗi ngày. Tư vấn nào đúng?</w:t>
+      </w:r>
+    </w:p>
+    <w:p>
+      <w:pPr>
+        <w:pStyle w:val="Option"/>
+      </w:pPr>
+      <w:r>
+        <w:t>A. Cho uống ngay dù chưa biết nguồn fluor khác</w:t>
+      </w:r>
+    </w:p>
+    <w:p>
+      <w:pPr>
+        <w:pStyle w:val="Option"/>
+      </w:pPr>
+      <w:r>
+        <w:t>B. Cho viên fluor và kem fluor của người lớn</w:t>
+      </w:r>
+    </w:p>
+    <w:p>
+      <w:pPr>
+        <w:pStyle w:val="Option"/>
+      </w:pPr>
+      <w:r>
+        <w:t>C. Không tự cho dùng; bác sĩ đánh giá tuổi, nguy cơ và nguồn fluor trước khi cân nhắc</w:t>
+      </w:r>
+    </w:p>
+    <w:p>
+      <w:pPr>
+        <w:pStyle w:val="Option"/>
+      </w:pPr>
+      <w:r>
+        <w:t>D. Trám bít hố rãnh của răng chưa mọc</w:t>
       </w:r>
     </w:p>
     <w:p>
@@ -6889,7 +6889,7 @@
         <w:pStyle w:val="Answer"/>
       </w:pPr>
       <w:r>
-        <w:t>Giải thích: SGK nhấn mạnh hiệu quả của fluor tại chỗ đều đặn sau mọc răng; điều đó không cấp phép tự kê fluor toàn thân cho trẻ cụ thể.</w:t>
+        <w:t>Giải thích: Không tự kê viên fluor cho trẻ sơ sinh. Về sau, bác sĩ cân nhắc theo tuổi, nguy cơ sâu răng và lượng fluor trong nước uống.</w:t>
       </w:r>
     </w:p>
     <w:sectPr>

</xml_diff>